<commit_message>
Create TASKS.md with detailed tasks, and start to work on the documentation
</commit_message>
<xml_diff>
--- a/docs/Zastosowanie narzędzi sztucznej inteligencji do klasyfikacji kart do gry.docx
+++ b/docs/Zastosowanie narzędzi sztucznej inteligencji do klasyfikacji kart do gry.docx
@@ -5,7 +5,11 @@
     <w:sdt>
       <w:sdtPr>
         <w:rPr>
+          <w:rFonts w:eastAsiaTheme="minorHAnsi"/>
           <w:color w:val="156082" w:themeColor="accent1"/>
+          <w:kern w:val="2"/>
+          <w:lang w:eastAsia="en-US"/>
+          <w14:ligatures w14:val="standardContextual"/>
         </w:rPr>
         <w:id w:val="353924425"/>
         <w:docPartObj>
@@ -15,15 +19,11 @@
       </w:sdtPr>
       <w:sdtEndPr>
         <w:rPr>
-          <w:rFonts w:eastAsiaTheme="minorHAnsi"/>
           <w:b/>
           <w:bCs/>
           <w:color w:val="404040" w:themeColor="text1" w:themeTint="BF"/>
-          <w:kern w:val="2"/>
           <w:sz w:val="48"/>
           <w:szCs w:val="48"/>
-          <w:lang w:eastAsia="en-US"/>
-          <w14:ligatures w14:val="standardContextual"/>
         </w:rPr>
       </w:sdtEndPr>
       <w:sdtContent>
@@ -57,7 +57,7 @@
                         <pic:cNvPicPr/>
                       </pic:nvPicPr>
                       <pic:blipFill>
-                        <a:blip r:embed="rId6" cstate="print">
+                        <a:blip r:embed="rId7" cstate="print">
                           <a:duotone>
                             <a:schemeClr val="accent1">
                               <a:shade val="45000"/>
@@ -518,7 +518,7 @@
                         <pic:cNvPicPr/>
                       </pic:nvPicPr>
                       <pic:blipFill>
-                        <a:blip r:embed="rId7" cstate="print">
+                        <a:blip r:embed="rId8" cstate="print">
                           <a:duotone>
                             <a:schemeClr val="accent1">
                               <a:shade val="45000"/>
@@ -580,6 +580,15 @@
     </w:sdt>
     <w:sdt>
       <w:sdtPr>
+        <w:rPr>
+          <w:rFonts w:asciiTheme="minorHAnsi" w:eastAsiaTheme="minorHAnsi" w:hAnsiTheme="minorHAnsi" w:cstheme="minorBidi"/>
+          <w:color w:val="auto"/>
+          <w:kern w:val="2"/>
+          <w:sz w:val="22"/>
+          <w:szCs w:val="22"/>
+          <w:lang w:eastAsia="en-US"/>
+          <w14:ligatures w14:val="standardContextual"/>
+        </w:rPr>
         <w:id w:val="1361624637"/>
         <w:docPartObj>
           <w:docPartGallery w:val="Table of Contents"/>
@@ -588,15 +597,7 @@
       </w:sdtPr>
       <w:sdtEndPr>
         <w:rPr>
-          <w:rFonts w:asciiTheme="minorHAnsi" w:eastAsiaTheme="minorHAnsi" w:hAnsiTheme="minorHAnsi" w:cstheme="minorBidi"/>
-          <w:b/>
           <w:bCs/>
-          <w:color w:val="auto"/>
-          <w:kern w:val="2"/>
-          <w:sz w:val="22"/>
-          <w:szCs w:val="22"/>
-          <w:lang w:eastAsia="en-US"/>
-          <w14:ligatures w14:val="standardContextual"/>
         </w:rPr>
       </w:sdtEndPr>
       <w:sdtContent>
@@ -604,33 +605,2085 @@
           <w:pPr>
             <w:pStyle w:val="Nagwekspisutreci"/>
             <w:rPr>
-              <w:b/>
+              <w:b w:val="0"/>
               <w:bCs/>
-              <w:sz w:val="52"/>
-              <w:szCs w:val="52"/>
+              <w:sz w:val="72"/>
+              <w:szCs w:val="72"/>
             </w:rPr>
           </w:pPr>
           <w:r>
             <w:rPr>
-              <w:b/>
               <w:bCs/>
-              <w:sz w:val="52"/>
-              <w:szCs w:val="52"/>
+              <w:sz w:val="72"/>
+              <w:szCs w:val="72"/>
             </w:rPr>
             <w:t>Spis treści</w:t>
           </w:r>
         </w:p>
         <w:p>
-          <w:fldSimple w:instr=" TOC \o &quot;1-3&quot; \h \z \u ">
-            <w:r>
-              <w:rPr>
-                <w:b/>
-                <w:bCs/>
-                <w:noProof/>
-              </w:rPr>
-              <w:t>Nie znaleziono żadnych pozycji spisu treści.</w:t>
-            </w:r>
-          </w:fldSimple>
+          <w:pPr>
+            <w:pStyle w:val="Spistreci1"/>
+            <w:tabs>
+              <w:tab w:val="left" w:pos="480"/>
+              <w:tab w:val="right" w:leader="dot" w:pos="9062"/>
+            </w:tabs>
+            <w:rPr>
+              <w:rFonts w:eastAsiaTheme="minorEastAsia"/>
+              <w:noProof/>
+              <w:sz w:val="32"/>
+              <w:szCs w:val="32"/>
+              <w:lang w:eastAsia="pl-PL"/>
+            </w:rPr>
+          </w:pPr>
+          <w:r>
+            <w:rPr>
+              <w:sz w:val="32"/>
+              <w:szCs w:val="32"/>
+            </w:rPr>
+            <w:fldChar w:fldCharType="begin"/>
+          </w:r>
+          <w:r>
+            <w:rPr>
+              <w:sz w:val="32"/>
+              <w:szCs w:val="32"/>
+            </w:rPr>
+            <w:instrText xml:space="preserve"> TOC \o "1-3" \h \z \u </w:instrText>
+          </w:r>
+          <w:r>
+            <w:rPr>
+              <w:sz w:val="32"/>
+              <w:szCs w:val="32"/>
+            </w:rPr>
+            <w:fldChar w:fldCharType="separate"/>
+          </w:r>
+          <w:hyperlink w:anchor="_Toc242214436" w:history="1">
+            <w:r>
+              <w:rPr>
+                <w:rStyle w:val="Hipercze"/>
+                <w:noProof/>
+                <w:sz w:val="32"/>
+                <w:szCs w:val="32"/>
+              </w:rPr>
+              <w:t>1.</w:t>
+            </w:r>
+            <w:r>
+              <w:rPr>
+                <w:rFonts w:eastAsiaTheme="minorEastAsia"/>
+                <w:noProof/>
+                <w:sz w:val="32"/>
+                <w:szCs w:val="32"/>
+                <w:lang w:eastAsia="pl-PL"/>
+              </w:rPr>
+              <w:tab/>
+            </w:r>
+            <w:r>
+              <w:rPr>
+                <w:rStyle w:val="Hipercze"/>
+                <w:noProof/>
+                <w:sz w:val="32"/>
+                <w:szCs w:val="32"/>
+              </w:rPr>
+              <w:t>Wstęp</w:t>
+            </w:r>
+            <w:r>
+              <w:rPr>
+                <w:noProof/>
+                <w:webHidden/>
+                <w:sz w:val="32"/>
+                <w:szCs w:val="32"/>
+              </w:rPr>
+              <w:tab/>
+            </w:r>
+            <w:r>
+              <w:rPr>
+                <w:noProof/>
+                <w:webHidden/>
+                <w:sz w:val="32"/>
+                <w:szCs w:val="32"/>
+              </w:rPr>
+              <w:fldChar w:fldCharType="begin"/>
+            </w:r>
+            <w:r>
+              <w:rPr>
+                <w:noProof/>
+                <w:webHidden/>
+                <w:sz w:val="32"/>
+                <w:szCs w:val="32"/>
+              </w:rPr>
+              <w:instrText xml:space="preserve"> PAGEREF _Toc242214436 \h </w:instrText>
+            </w:r>
+            <w:r>
+              <w:rPr>
+                <w:noProof/>
+                <w:webHidden/>
+                <w:sz w:val="32"/>
+                <w:szCs w:val="32"/>
+              </w:rPr>
+            </w:r>
+            <w:r>
+              <w:rPr>
+                <w:noProof/>
+                <w:webHidden/>
+                <w:sz w:val="32"/>
+                <w:szCs w:val="32"/>
+              </w:rPr>
+              <w:fldChar w:fldCharType="separate"/>
+            </w:r>
+            <w:r>
+              <w:rPr>
+                <w:noProof/>
+                <w:webHidden/>
+                <w:sz w:val="32"/>
+                <w:szCs w:val="32"/>
+              </w:rPr>
+              <w:t>2</w:t>
+            </w:r>
+            <w:r>
+              <w:rPr>
+                <w:noProof/>
+                <w:webHidden/>
+                <w:sz w:val="32"/>
+                <w:szCs w:val="32"/>
+              </w:rPr>
+              <w:fldChar w:fldCharType="end"/>
+            </w:r>
+          </w:hyperlink>
+        </w:p>
+        <w:p>
+          <w:pPr>
+            <w:pStyle w:val="Spistreci1"/>
+            <w:tabs>
+              <w:tab w:val="left" w:pos="480"/>
+              <w:tab w:val="right" w:leader="dot" w:pos="9062"/>
+            </w:tabs>
+            <w:rPr>
+              <w:rFonts w:eastAsiaTheme="minorEastAsia"/>
+              <w:noProof/>
+              <w:sz w:val="32"/>
+              <w:szCs w:val="32"/>
+              <w:lang w:eastAsia="pl-PL"/>
+            </w:rPr>
+          </w:pPr>
+          <w:hyperlink w:anchor="_Toc242214437" w:history="1">
+            <w:r>
+              <w:rPr>
+                <w:rStyle w:val="Hipercze"/>
+                <w:noProof/>
+                <w:sz w:val="32"/>
+                <w:szCs w:val="32"/>
+              </w:rPr>
+              <w:t>2.</w:t>
+            </w:r>
+            <w:r>
+              <w:rPr>
+                <w:rFonts w:eastAsiaTheme="minorEastAsia"/>
+                <w:noProof/>
+                <w:sz w:val="32"/>
+                <w:szCs w:val="32"/>
+                <w:lang w:eastAsia="pl-PL"/>
+              </w:rPr>
+              <w:tab/>
+            </w:r>
+            <w:r>
+              <w:rPr>
+                <w:rStyle w:val="Hipercze"/>
+                <w:noProof/>
+                <w:sz w:val="32"/>
+                <w:szCs w:val="32"/>
+              </w:rPr>
+              <w:t>Podstawy teoretyczne</w:t>
+            </w:r>
+            <w:r>
+              <w:rPr>
+                <w:noProof/>
+                <w:webHidden/>
+                <w:sz w:val="32"/>
+                <w:szCs w:val="32"/>
+              </w:rPr>
+              <w:tab/>
+            </w:r>
+            <w:r>
+              <w:rPr>
+                <w:noProof/>
+                <w:webHidden/>
+                <w:sz w:val="32"/>
+                <w:szCs w:val="32"/>
+              </w:rPr>
+              <w:fldChar w:fldCharType="begin"/>
+            </w:r>
+            <w:r>
+              <w:rPr>
+                <w:noProof/>
+                <w:webHidden/>
+                <w:sz w:val="32"/>
+                <w:szCs w:val="32"/>
+              </w:rPr>
+              <w:instrText xml:space="preserve"> PAGEREF _Toc242214437 \h </w:instrText>
+            </w:r>
+            <w:r>
+              <w:rPr>
+                <w:noProof/>
+                <w:webHidden/>
+                <w:sz w:val="32"/>
+                <w:szCs w:val="32"/>
+              </w:rPr>
+            </w:r>
+            <w:r>
+              <w:rPr>
+                <w:noProof/>
+                <w:webHidden/>
+                <w:sz w:val="32"/>
+                <w:szCs w:val="32"/>
+              </w:rPr>
+              <w:fldChar w:fldCharType="separate"/>
+            </w:r>
+            <w:r>
+              <w:rPr>
+                <w:noProof/>
+                <w:webHidden/>
+                <w:sz w:val="32"/>
+                <w:szCs w:val="32"/>
+              </w:rPr>
+              <w:t>2</w:t>
+            </w:r>
+            <w:r>
+              <w:rPr>
+                <w:noProof/>
+                <w:webHidden/>
+                <w:sz w:val="32"/>
+                <w:szCs w:val="32"/>
+              </w:rPr>
+              <w:fldChar w:fldCharType="end"/>
+            </w:r>
+          </w:hyperlink>
+        </w:p>
+        <w:p>
+          <w:pPr>
+            <w:pStyle w:val="Spistreci2"/>
+            <w:tabs>
+              <w:tab w:val="left" w:pos="960"/>
+              <w:tab w:val="right" w:leader="dot" w:pos="9062"/>
+            </w:tabs>
+            <w:rPr>
+              <w:rFonts w:eastAsiaTheme="minorEastAsia"/>
+              <w:noProof/>
+              <w:sz w:val="32"/>
+              <w:szCs w:val="32"/>
+              <w:lang w:eastAsia="pl-PL"/>
+            </w:rPr>
+          </w:pPr>
+          <w:hyperlink w:anchor="_Toc242214438" w:history="1">
+            <w:r>
+              <w:rPr>
+                <w:rStyle w:val="Hipercze"/>
+                <w:noProof/>
+                <w:sz w:val="32"/>
+                <w:szCs w:val="32"/>
+              </w:rPr>
+              <w:t>2.1.</w:t>
+            </w:r>
+            <w:r>
+              <w:rPr>
+                <w:rFonts w:eastAsiaTheme="minorEastAsia"/>
+                <w:noProof/>
+                <w:sz w:val="32"/>
+                <w:szCs w:val="32"/>
+                <w:lang w:eastAsia="pl-PL"/>
+              </w:rPr>
+              <w:tab/>
+            </w:r>
+            <w:r>
+              <w:rPr>
+                <w:rStyle w:val="Hipercze"/>
+                <w:noProof/>
+                <w:sz w:val="32"/>
+                <w:szCs w:val="32"/>
+              </w:rPr>
+              <w:t>Uczenie maszynowe i głębokie</w:t>
+            </w:r>
+            <w:r>
+              <w:rPr>
+                <w:noProof/>
+                <w:webHidden/>
+                <w:sz w:val="32"/>
+                <w:szCs w:val="32"/>
+              </w:rPr>
+              <w:tab/>
+            </w:r>
+            <w:r>
+              <w:rPr>
+                <w:noProof/>
+                <w:webHidden/>
+                <w:sz w:val="32"/>
+                <w:szCs w:val="32"/>
+              </w:rPr>
+              <w:fldChar w:fldCharType="begin"/>
+            </w:r>
+            <w:r>
+              <w:rPr>
+                <w:noProof/>
+                <w:webHidden/>
+                <w:sz w:val="32"/>
+                <w:szCs w:val="32"/>
+              </w:rPr>
+              <w:instrText xml:space="preserve"> PAGEREF _Toc242214438 \h </w:instrText>
+            </w:r>
+            <w:r>
+              <w:rPr>
+                <w:noProof/>
+                <w:webHidden/>
+                <w:sz w:val="32"/>
+                <w:szCs w:val="32"/>
+              </w:rPr>
+            </w:r>
+            <w:r>
+              <w:rPr>
+                <w:noProof/>
+                <w:webHidden/>
+                <w:sz w:val="32"/>
+                <w:szCs w:val="32"/>
+              </w:rPr>
+              <w:fldChar w:fldCharType="separate"/>
+            </w:r>
+            <w:r>
+              <w:rPr>
+                <w:noProof/>
+                <w:webHidden/>
+                <w:sz w:val="32"/>
+                <w:szCs w:val="32"/>
+              </w:rPr>
+              <w:t>2</w:t>
+            </w:r>
+            <w:r>
+              <w:rPr>
+                <w:noProof/>
+                <w:webHidden/>
+                <w:sz w:val="32"/>
+                <w:szCs w:val="32"/>
+              </w:rPr>
+              <w:fldChar w:fldCharType="end"/>
+            </w:r>
+          </w:hyperlink>
+        </w:p>
+        <w:p>
+          <w:pPr>
+            <w:pStyle w:val="Spistreci2"/>
+            <w:tabs>
+              <w:tab w:val="left" w:pos="960"/>
+              <w:tab w:val="right" w:leader="dot" w:pos="9062"/>
+            </w:tabs>
+            <w:rPr>
+              <w:rFonts w:eastAsiaTheme="minorEastAsia"/>
+              <w:noProof/>
+              <w:sz w:val="32"/>
+              <w:szCs w:val="32"/>
+              <w:lang w:eastAsia="pl-PL"/>
+            </w:rPr>
+          </w:pPr>
+          <w:hyperlink w:anchor="_Toc242214439" w:history="1">
+            <w:r>
+              <w:rPr>
+                <w:rStyle w:val="Hipercze"/>
+                <w:noProof/>
+                <w:sz w:val="32"/>
+                <w:szCs w:val="32"/>
+              </w:rPr>
+              <w:t>2.2.</w:t>
+            </w:r>
+            <w:r>
+              <w:rPr>
+                <w:rFonts w:eastAsiaTheme="minorEastAsia"/>
+                <w:noProof/>
+                <w:sz w:val="32"/>
+                <w:szCs w:val="32"/>
+                <w:lang w:eastAsia="pl-PL"/>
+              </w:rPr>
+              <w:tab/>
+            </w:r>
+            <w:r>
+              <w:rPr>
+                <w:rStyle w:val="Hipercze"/>
+                <w:noProof/>
+                <w:sz w:val="32"/>
+                <w:szCs w:val="32"/>
+              </w:rPr>
+              <w:t>Widzenie komputerowe</w:t>
+            </w:r>
+            <w:r>
+              <w:rPr>
+                <w:noProof/>
+                <w:webHidden/>
+                <w:sz w:val="32"/>
+                <w:szCs w:val="32"/>
+              </w:rPr>
+              <w:tab/>
+            </w:r>
+            <w:r>
+              <w:rPr>
+                <w:noProof/>
+                <w:webHidden/>
+                <w:sz w:val="32"/>
+                <w:szCs w:val="32"/>
+              </w:rPr>
+              <w:fldChar w:fldCharType="begin"/>
+            </w:r>
+            <w:r>
+              <w:rPr>
+                <w:noProof/>
+                <w:webHidden/>
+                <w:sz w:val="32"/>
+                <w:szCs w:val="32"/>
+              </w:rPr>
+              <w:instrText xml:space="preserve"> PAGEREF _Toc242214439 \h </w:instrText>
+            </w:r>
+            <w:r>
+              <w:rPr>
+                <w:noProof/>
+                <w:webHidden/>
+                <w:sz w:val="32"/>
+                <w:szCs w:val="32"/>
+              </w:rPr>
+            </w:r>
+            <w:r>
+              <w:rPr>
+                <w:noProof/>
+                <w:webHidden/>
+                <w:sz w:val="32"/>
+                <w:szCs w:val="32"/>
+              </w:rPr>
+              <w:fldChar w:fldCharType="separate"/>
+            </w:r>
+            <w:r>
+              <w:rPr>
+                <w:noProof/>
+                <w:webHidden/>
+                <w:sz w:val="32"/>
+                <w:szCs w:val="32"/>
+              </w:rPr>
+              <w:t>2</w:t>
+            </w:r>
+            <w:r>
+              <w:rPr>
+                <w:noProof/>
+                <w:webHidden/>
+                <w:sz w:val="32"/>
+                <w:szCs w:val="32"/>
+              </w:rPr>
+              <w:fldChar w:fldCharType="end"/>
+            </w:r>
+          </w:hyperlink>
+        </w:p>
+        <w:p>
+          <w:pPr>
+            <w:pStyle w:val="Spistreci2"/>
+            <w:tabs>
+              <w:tab w:val="left" w:pos="960"/>
+              <w:tab w:val="right" w:leader="dot" w:pos="9062"/>
+            </w:tabs>
+            <w:rPr>
+              <w:rFonts w:eastAsiaTheme="minorEastAsia"/>
+              <w:noProof/>
+              <w:sz w:val="32"/>
+              <w:szCs w:val="32"/>
+              <w:lang w:eastAsia="pl-PL"/>
+            </w:rPr>
+          </w:pPr>
+          <w:hyperlink w:anchor="_Toc242214440" w:history="1">
+            <w:r>
+              <w:rPr>
+                <w:rStyle w:val="Hipercze"/>
+                <w:noProof/>
+                <w:sz w:val="32"/>
+                <w:szCs w:val="32"/>
+              </w:rPr>
+              <w:t>2.3.</w:t>
+            </w:r>
+            <w:r>
+              <w:rPr>
+                <w:rFonts w:eastAsiaTheme="minorEastAsia"/>
+                <w:noProof/>
+                <w:sz w:val="32"/>
+                <w:szCs w:val="32"/>
+                <w:lang w:eastAsia="pl-PL"/>
+              </w:rPr>
+              <w:tab/>
+            </w:r>
+            <w:r>
+              <w:rPr>
+                <w:rStyle w:val="Hipercze"/>
+                <w:noProof/>
+                <w:sz w:val="32"/>
+                <w:szCs w:val="32"/>
+              </w:rPr>
+              <w:t>Sieci konwolucyjne</w:t>
+            </w:r>
+            <w:r>
+              <w:rPr>
+                <w:noProof/>
+                <w:webHidden/>
+                <w:sz w:val="32"/>
+                <w:szCs w:val="32"/>
+              </w:rPr>
+              <w:tab/>
+            </w:r>
+            <w:r>
+              <w:rPr>
+                <w:noProof/>
+                <w:webHidden/>
+                <w:sz w:val="32"/>
+                <w:szCs w:val="32"/>
+              </w:rPr>
+              <w:fldChar w:fldCharType="begin"/>
+            </w:r>
+            <w:r>
+              <w:rPr>
+                <w:noProof/>
+                <w:webHidden/>
+                <w:sz w:val="32"/>
+                <w:szCs w:val="32"/>
+              </w:rPr>
+              <w:instrText xml:space="preserve"> PAGEREF _Toc242214440 \h </w:instrText>
+            </w:r>
+            <w:r>
+              <w:rPr>
+                <w:noProof/>
+                <w:webHidden/>
+                <w:sz w:val="32"/>
+                <w:szCs w:val="32"/>
+              </w:rPr>
+            </w:r>
+            <w:r>
+              <w:rPr>
+                <w:noProof/>
+                <w:webHidden/>
+                <w:sz w:val="32"/>
+                <w:szCs w:val="32"/>
+              </w:rPr>
+              <w:fldChar w:fldCharType="separate"/>
+            </w:r>
+            <w:r>
+              <w:rPr>
+                <w:noProof/>
+                <w:webHidden/>
+                <w:sz w:val="32"/>
+                <w:szCs w:val="32"/>
+              </w:rPr>
+              <w:t>2</w:t>
+            </w:r>
+            <w:r>
+              <w:rPr>
+                <w:noProof/>
+                <w:webHidden/>
+                <w:sz w:val="32"/>
+                <w:szCs w:val="32"/>
+              </w:rPr>
+              <w:fldChar w:fldCharType="end"/>
+            </w:r>
+          </w:hyperlink>
+        </w:p>
+        <w:p>
+          <w:pPr>
+            <w:pStyle w:val="Spistreci2"/>
+            <w:tabs>
+              <w:tab w:val="left" w:pos="960"/>
+              <w:tab w:val="right" w:leader="dot" w:pos="9062"/>
+            </w:tabs>
+            <w:rPr>
+              <w:rFonts w:eastAsiaTheme="minorEastAsia"/>
+              <w:noProof/>
+              <w:sz w:val="32"/>
+              <w:szCs w:val="32"/>
+              <w:lang w:eastAsia="pl-PL"/>
+            </w:rPr>
+          </w:pPr>
+          <w:hyperlink w:anchor="_Toc242214441" w:history="1">
+            <w:r>
+              <w:rPr>
+                <w:rStyle w:val="Hipercze"/>
+                <w:noProof/>
+                <w:sz w:val="32"/>
+                <w:szCs w:val="32"/>
+              </w:rPr>
+              <w:t>2.4.</w:t>
+            </w:r>
+            <w:r>
+              <w:rPr>
+                <w:rFonts w:eastAsiaTheme="minorEastAsia"/>
+                <w:noProof/>
+                <w:sz w:val="32"/>
+                <w:szCs w:val="32"/>
+                <w:lang w:eastAsia="pl-PL"/>
+              </w:rPr>
+              <w:tab/>
+            </w:r>
+            <w:r>
+              <w:rPr>
+                <w:rStyle w:val="Hipercze"/>
+                <w:noProof/>
+                <w:sz w:val="32"/>
+                <w:szCs w:val="32"/>
+              </w:rPr>
+              <w:t>Klasyfikacja obrazów</w:t>
+            </w:r>
+            <w:r>
+              <w:rPr>
+                <w:noProof/>
+                <w:webHidden/>
+                <w:sz w:val="32"/>
+                <w:szCs w:val="32"/>
+              </w:rPr>
+              <w:tab/>
+            </w:r>
+            <w:r>
+              <w:rPr>
+                <w:noProof/>
+                <w:webHidden/>
+                <w:sz w:val="32"/>
+                <w:szCs w:val="32"/>
+              </w:rPr>
+              <w:fldChar w:fldCharType="begin"/>
+            </w:r>
+            <w:r>
+              <w:rPr>
+                <w:noProof/>
+                <w:webHidden/>
+                <w:sz w:val="32"/>
+                <w:szCs w:val="32"/>
+              </w:rPr>
+              <w:instrText xml:space="preserve"> PAGEREF _Toc242214441 \h </w:instrText>
+            </w:r>
+            <w:r>
+              <w:rPr>
+                <w:noProof/>
+                <w:webHidden/>
+                <w:sz w:val="32"/>
+                <w:szCs w:val="32"/>
+              </w:rPr>
+            </w:r>
+            <w:r>
+              <w:rPr>
+                <w:noProof/>
+                <w:webHidden/>
+                <w:sz w:val="32"/>
+                <w:szCs w:val="32"/>
+              </w:rPr>
+              <w:fldChar w:fldCharType="separate"/>
+            </w:r>
+            <w:r>
+              <w:rPr>
+                <w:noProof/>
+                <w:webHidden/>
+                <w:sz w:val="32"/>
+                <w:szCs w:val="32"/>
+              </w:rPr>
+              <w:t>2</w:t>
+            </w:r>
+            <w:r>
+              <w:rPr>
+                <w:noProof/>
+                <w:webHidden/>
+                <w:sz w:val="32"/>
+                <w:szCs w:val="32"/>
+              </w:rPr>
+              <w:fldChar w:fldCharType="end"/>
+            </w:r>
+          </w:hyperlink>
+        </w:p>
+        <w:p>
+          <w:pPr>
+            <w:pStyle w:val="Spistreci2"/>
+            <w:tabs>
+              <w:tab w:val="left" w:pos="960"/>
+              <w:tab w:val="right" w:leader="dot" w:pos="9062"/>
+            </w:tabs>
+            <w:rPr>
+              <w:rFonts w:eastAsiaTheme="minorEastAsia"/>
+              <w:noProof/>
+              <w:sz w:val="32"/>
+              <w:szCs w:val="32"/>
+              <w:lang w:eastAsia="pl-PL"/>
+            </w:rPr>
+          </w:pPr>
+          <w:hyperlink w:anchor="_Toc242214442" w:history="1">
+            <w:r>
+              <w:rPr>
+                <w:rStyle w:val="Hipercze"/>
+                <w:noProof/>
+                <w:sz w:val="32"/>
+                <w:szCs w:val="32"/>
+              </w:rPr>
+              <w:t>2.5.</w:t>
+            </w:r>
+            <w:r>
+              <w:rPr>
+                <w:rFonts w:eastAsiaTheme="minorEastAsia"/>
+                <w:noProof/>
+                <w:sz w:val="32"/>
+                <w:szCs w:val="32"/>
+                <w:lang w:eastAsia="pl-PL"/>
+              </w:rPr>
+              <w:tab/>
+            </w:r>
+            <w:r>
+              <w:rPr>
+                <w:rStyle w:val="Hipercze"/>
+                <w:noProof/>
+                <w:sz w:val="32"/>
+                <w:szCs w:val="32"/>
+              </w:rPr>
+              <w:t>Detekcja obiektów i rodzina YOLO</w:t>
+            </w:r>
+            <w:r>
+              <w:rPr>
+                <w:noProof/>
+                <w:webHidden/>
+                <w:sz w:val="32"/>
+                <w:szCs w:val="32"/>
+              </w:rPr>
+              <w:tab/>
+            </w:r>
+            <w:r>
+              <w:rPr>
+                <w:noProof/>
+                <w:webHidden/>
+                <w:sz w:val="32"/>
+                <w:szCs w:val="32"/>
+              </w:rPr>
+              <w:fldChar w:fldCharType="begin"/>
+            </w:r>
+            <w:r>
+              <w:rPr>
+                <w:noProof/>
+                <w:webHidden/>
+                <w:sz w:val="32"/>
+                <w:szCs w:val="32"/>
+              </w:rPr>
+              <w:instrText xml:space="preserve"> PAGEREF _Toc242214442 \h </w:instrText>
+            </w:r>
+            <w:r>
+              <w:rPr>
+                <w:noProof/>
+                <w:webHidden/>
+                <w:sz w:val="32"/>
+                <w:szCs w:val="32"/>
+              </w:rPr>
+            </w:r>
+            <w:r>
+              <w:rPr>
+                <w:noProof/>
+                <w:webHidden/>
+                <w:sz w:val="32"/>
+                <w:szCs w:val="32"/>
+              </w:rPr>
+              <w:fldChar w:fldCharType="separate"/>
+            </w:r>
+            <w:r>
+              <w:rPr>
+                <w:noProof/>
+                <w:webHidden/>
+                <w:sz w:val="32"/>
+                <w:szCs w:val="32"/>
+              </w:rPr>
+              <w:t>2</w:t>
+            </w:r>
+            <w:r>
+              <w:rPr>
+                <w:noProof/>
+                <w:webHidden/>
+                <w:sz w:val="32"/>
+                <w:szCs w:val="32"/>
+              </w:rPr>
+              <w:fldChar w:fldCharType="end"/>
+            </w:r>
+          </w:hyperlink>
+        </w:p>
+        <w:p>
+          <w:pPr>
+            <w:pStyle w:val="Spistreci2"/>
+            <w:tabs>
+              <w:tab w:val="left" w:pos="960"/>
+              <w:tab w:val="right" w:leader="dot" w:pos="9062"/>
+            </w:tabs>
+            <w:rPr>
+              <w:rFonts w:eastAsiaTheme="minorEastAsia"/>
+              <w:noProof/>
+              <w:sz w:val="32"/>
+              <w:szCs w:val="32"/>
+              <w:lang w:eastAsia="pl-PL"/>
+            </w:rPr>
+          </w:pPr>
+          <w:hyperlink w:anchor="_Toc242214443" w:history="1">
+            <w:r>
+              <w:rPr>
+                <w:rStyle w:val="Hipercze"/>
+                <w:noProof/>
+                <w:sz w:val="32"/>
+                <w:szCs w:val="32"/>
+              </w:rPr>
+              <w:t>2.6.</w:t>
+            </w:r>
+            <w:r>
+              <w:rPr>
+                <w:rFonts w:eastAsiaTheme="minorEastAsia"/>
+                <w:noProof/>
+                <w:sz w:val="32"/>
+                <w:szCs w:val="32"/>
+                <w:lang w:eastAsia="pl-PL"/>
+              </w:rPr>
+              <w:tab/>
+            </w:r>
+            <w:r>
+              <w:rPr>
+                <w:rStyle w:val="Hipercze"/>
+                <w:noProof/>
+                <w:sz w:val="32"/>
+                <w:szCs w:val="32"/>
+              </w:rPr>
+              <w:t>Transfer learning</w:t>
+            </w:r>
+            <w:r>
+              <w:rPr>
+                <w:noProof/>
+                <w:webHidden/>
+                <w:sz w:val="32"/>
+                <w:szCs w:val="32"/>
+              </w:rPr>
+              <w:tab/>
+            </w:r>
+            <w:r>
+              <w:rPr>
+                <w:noProof/>
+                <w:webHidden/>
+                <w:sz w:val="32"/>
+                <w:szCs w:val="32"/>
+              </w:rPr>
+              <w:fldChar w:fldCharType="begin"/>
+            </w:r>
+            <w:r>
+              <w:rPr>
+                <w:noProof/>
+                <w:webHidden/>
+                <w:sz w:val="32"/>
+                <w:szCs w:val="32"/>
+              </w:rPr>
+              <w:instrText xml:space="preserve"> PAGEREF _Toc242214443 \h </w:instrText>
+            </w:r>
+            <w:r>
+              <w:rPr>
+                <w:noProof/>
+                <w:webHidden/>
+                <w:sz w:val="32"/>
+                <w:szCs w:val="32"/>
+              </w:rPr>
+            </w:r>
+            <w:r>
+              <w:rPr>
+                <w:noProof/>
+                <w:webHidden/>
+                <w:sz w:val="32"/>
+                <w:szCs w:val="32"/>
+              </w:rPr>
+              <w:fldChar w:fldCharType="separate"/>
+            </w:r>
+            <w:r>
+              <w:rPr>
+                <w:noProof/>
+                <w:webHidden/>
+                <w:sz w:val="32"/>
+                <w:szCs w:val="32"/>
+              </w:rPr>
+              <w:t>2</w:t>
+            </w:r>
+            <w:r>
+              <w:rPr>
+                <w:noProof/>
+                <w:webHidden/>
+                <w:sz w:val="32"/>
+                <w:szCs w:val="32"/>
+              </w:rPr>
+              <w:fldChar w:fldCharType="end"/>
+            </w:r>
+          </w:hyperlink>
+        </w:p>
+        <w:p>
+          <w:pPr>
+            <w:pStyle w:val="Spistreci2"/>
+            <w:tabs>
+              <w:tab w:val="left" w:pos="960"/>
+              <w:tab w:val="right" w:leader="dot" w:pos="9062"/>
+            </w:tabs>
+            <w:rPr>
+              <w:rFonts w:eastAsiaTheme="minorEastAsia"/>
+              <w:noProof/>
+              <w:sz w:val="32"/>
+              <w:szCs w:val="32"/>
+              <w:lang w:eastAsia="pl-PL"/>
+            </w:rPr>
+          </w:pPr>
+          <w:hyperlink w:anchor="_Toc242214444" w:history="1">
+            <w:r>
+              <w:rPr>
+                <w:rStyle w:val="Hipercze"/>
+                <w:noProof/>
+                <w:sz w:val="32"/>
+                <w:szCs w:val="32"/>
+              </w:rPr>
+              <w:t>2.7.</w:t>
+            </w:r>
+            <w:r>
+              <w:rPr>
+                <w:rFonts w:eastAsiaTheme="minorEastAsia"/>
+                <w:noProof/>
+                <w:sz w:val="32"/>
+                <w:szCs w:val="32"/>
+                <w:lang w:eastAsia="pl-PL"/>
+              </w:rPr>
+              <w:tab/>
+            </w:r>
+            <w:r>
+              <w:rPr>
+                <w:rStyle w:val="Hipercze"/>
+                <w:noProof/>
+                <w:sz w:val="32"/>
+                <w:szCs w:val="32"/>
+              </w:rPr>
+              <w:t>Augmentacja danych</w:t>
+            </w:r>
+            <w:r>
+              <w:rPr>
+                <w:noProof/>
+                <w:webHidden/>
+                <w:sz w:val="32"/>
+                <w:szCs w:val="32"/>
+              </w:rPr>
+              <w:tab/>
+            </w:r>
+            <w:r>
+              <w:rPr>
+                <w:noProof/>
+                <w:webHidden/>
+                <w:sz w:val="32"/>
+                <w:szCs w:val="32"/>
+              </w:rPr>
+              <w:fldChar w:fldCharType="begin"/>
+            </w:r>
+            <w:r>
+              <w:rPr>
+                <w:noProof/>
+                <w:webHidden/>
+                <w:sz w:val="32"/>
+                <w:szCs w:val="32"/>
+              </w:rPr>
+              <w:instrText xml:space="preserve"> PAGEREF _Toc242214444 \h </w:instrText>
+            </w:r>
+            <w:r>
+              <w:rPr>
+                <w:noProof/>
+                <w:webHidden/>
+                <w:sz w:val="32"/>
+                <w:szCs w:val="32"/>
+              </w:rPr>
+            </w:r>
+            <w:r>
+              <w:rPr>
+                <w:noProof/>
+                <w:webHidden/>
+                <w:sz w:val="32"/>
+                <w:szCs w:val="32"/>
+              </w:rPr>
+              <w:fldChar w:fldCharType="separate"/>
+            </w:r>
+            <w:r>
+              <w:rPr>
+                <w:noProof/>
+                <w:webHidden/>
+                <w:sz w:val="32"/>
+                <w:szCs w:val="32"/>
+              </w:rPr>
+              <w:t>2</w:t>
+            </w:r>
+            <w:r>
+              <w:rPr>
+                <w:noProof/>
+                <w:webHidden/>
+                <w:sz w:val="32"/>
+                <w:szCs w:val="32"/>
+              </w:rPr>
+              <w:fldChar w:fldCharType="end"/>
+            </w:r>
+          </w:hyperlink>
+        </w:p>
+        <w:p>
+          <w:pPr>
+            <w:pStyle w:val="Spistreci2"/>
+            <w:tabs>
+              <w:tab w:val="left" w:pos="960"/>
+              <w:tab w:val="right" w:leader="dot" w:pos="9062"/>
+            </w:tabs>
+            <w:rPr>
+              <w:rFonts w:eastAsiaTheme="minorEastAsia"/>
+              <w:noProof/>
+              <w:sz w:val="32"/>
+              <w:szCs w:val="32"/>
+              <w:lang w:eastAsia="pl-PL"/>
+            </w:rPr>
+          </w:pPr>
+          <w:hyperlink w:anchor="_Toc242214445" w:history="1">
+            <w:r>
+              <w:rPr>
+                <w:rStyle w:val="Hipercze"/>
+                <w:noProof/>
+                <w:sz w:val="32"/>
+                <w:szCs w:val="32"/>
+              </w:rPr>
+              <w:t>2.8.</w:t>
+            </w:r>
+            <w:r>
+              <w:rPr>
+                <w:rFonts w:eastAsiaTheme="minorEastAsia"/>
+                <w:noProof/>
+                <w:sz w:val="32"/>
+                <w:szCs w:val="32"/>
+                <w:lang w:eastAsia="pl-PL"/>
+              </w:rPr>
+              <w:tab/>
+            </w:r>
+            <w:r>
+              <w:rPr>
+                <w:rStyle w:val="Hipercze"/>
+                <w:noProof/>
+                <w:sz w:val="32"/>
+                <w:szCs w:val="32"/>
+              </w:rPr>
+              <w:t>Metryki</w:t>
+            </w:r>
+            <w:r>
+              <w:rPr>
+                <w:noProof/>
+                <w:webHidden/>
+                <w:sz w:val="32"/>
+                <w:szCs w:val="32"/>
+              </w:rPr>
+              <w:tab/>
+            </w:r>
+            <w:r>
+              <w:rPr>
+                <w:noProof/>
+                <w:webHidden/>
+                <w:sz w:val="32"/>
+                <w:szCs w:val="32"/>
+              </w:rPr>
+              <w:fldChar w:fldCharType="begin"/>
+            </w:r>
+            <w:r>
+              <w:rPr>
+                <w:noProof/>
+                <w:webHidden/>
+                <w:sz w:val="32"/>
+                <w:szCs w:val="32"/>
+              </w:rPr>
+              <w:instrText xml:space="preserve"> PAGEREF _Toc242214445 \h </w:instrText>
+            </w:r>
+            <w:r>
+              <w:rPr>
+                <w:noProof/>
+                <w:webHidden/>
+                <w:sz w:val="32"/>
+                <w:szCs w:val="32"/>
+              </w:rPr>
+            </w:r>
+            <w:r>
+              <w:rPr>
+                <w:noProof/>
+                <w:webHidden/>
+                <w:sz w:val="32"/>
+                <w:szCs w:val="32"/>
+              </w:rPr>
+              <w:fldChar w:fldCharType="separate"/>
+            </w:r>
+            <w:r>
+              <w:rPr>
+                <w:noProof/>
+                <w:webHidden/>
+                <w:sz w:val="32"/>
+                <w:szCs w:val="32"/>
+              </w:rPr>
+              <w:t>2</w:t>
+            </w:r>
+            <w:r>
+              <w:rPr>
+                <w:noProof/>
+                <w:webHidden/>
+                <w:sz w:val="32"/>
+                <w:szCs w:val="32"/>
+              </w:rPr>
+              <w:fldChar w:fldCharType="end"/>
+            </w:r>
+          </w:hyperlink>
+        </w:p>
+        <w:p>
+          <w:pPr>
+            <w:pStyle w:val="Spistreci1"/>
+            <w:tabs>
+              <w:tab w:val="left" w:pos="480"/>
+              <w:tab w:val="right" w:leader="dot" w:pos="9062"/>
+            </w:tabs>
+            <w:rPr>
+              <w:rFonts w:eastAsiaTheme="minorEastAsia"/>
+              <w:noProof/>
+              <w:sz w:val="32"/>
+              <w:szCs w:val="32"/>
+              <w:lang w:eastAsia="pl-PL"/>
+            </w:rPr>
+          </w:pPr>
+          <w:hyperlink w:anchor="_Toc242214446" w:history="1">
+            <w:r>
+              <w:rPr>
+                <w:rStyle w:val="Hipercze"/>
+                <w:noProof/>
+                <w:sz w:val="32"/>
+                <w:szCs w:val="32"/>
+              </w:rPr>
+              <w:t>3.</w:t>
+            </w:r>
+            <w:r>
+              <w:rPr>
+                <w:rFonts w:eastAsiaTheme="minorEastAsia"/>
+                <w:noProof/>
+                <w:sz w:val="32"/>
+                <w:szCs w:val="32"/>
+                <w:lang w:eastAsia="pl-PL"/>
+              </w:rPr>
+              <w:tab/>
+            </w:r>
+            <w:r>
+              <w:rPr>
+                <w:rStyle w:val="Hipercze"/>
+                <w:noProof/>
+                <w:sz w:val="32"/>
+                <w:szCs w:val="32"/>
+              </w:rPr>
+              <w:t>Analiza problemu i przegląd rozwiązań</w:t>
+            </w:r>
+            <w:r>
+              <w:rPr>
+                <w:noProof/>
+                <w:webHidden/>
+                <w:sz w:val="32"/>
+                <w:szCs w:val="32"/>
+              </w:rPr>
+              <w:tab/>
+            </w:r>
+            <w:r>
+              <w:rPr>
+                <w:noProof/>
+                <w:webHidden/>
+                <w:sz w:val="32"/>
+                <w:szCs w:val="32"/>
+              </w:rPr>
+              <w:fldChar w:fldCharType="begin"/>
+            </w:r>
+            <w:r>
+              <w:rPr>
+                <w:noProof/>
+                <w:webHidden/>
+                <w:sz w:val="32"/>
+                <w:szCs w:val="32"/>
+              </w:rPr>
+              <w:instrText xml:space="preserve"> PAGEREF _Toc242214446 \h </w:instrText>
+            </w:r>
+            <w:r>
+              <w:rPr>
+                <w:noProof/>
+                <w:webHidden/>
+                <w:sz w:val="32"/>
+                <w:szCs w:val="32"/>
+              </w:rPr>
+            </w:r>
+            <w:r>
+              <w:rPr>
+                <w:noProof/>
+                <w:webHidden/>
+                <w:sz w:val="32"/>
+                <w:szCs w:val="32"/>
+              </w:rPr>
+              <w:fldChar w:fldCharType="separate"/>
+            </w:r>
+            <w:r>
+              <w:rPr>
+                <w:noProof/>
+                <w:webHidden/>
+                <w:sz w:val="32"/>
+                <w:szCs w:val="32"/>
+              </w:rPr>
+              <w:t>2</w:t>
+            </w:r>
+            <w:r>
+              <w:rPr>
+                <w:noProof/>
+                <w:webHidden/>
+                <w:sz w:val="32"/>
+                <w:szCs w:val="32"/>
+              </w:rPr>
+              <w:fldChar w:fldCharType="end"/>
+            </w:r>
+          </w:hyperlink>
+        </w:p>
+        <w:p>
+          <w:pPr>
+            <w:pStyle w:val="Spistreci1"/>
+            <w:tabs>
+              <w:tab w:val="left" w:pos="480"/>
+              <w:tab w:val="right" w:leader="dot" w:pos="9062"/>
+            </w:tabs>
+            <w:rPr>
+              <w:rFonts w:eastAsiaTheme="minorEastAsia"/>
+              <w:noProof/>
+              <w:sz w:val="32"/>
+              <w:szCs w:val="32"/>
+              <w:lang w:eastAsia="pl-PL"/>
+            </w:rPr>
+          </w:pPr>
+          <w:hyperlink w:anchor="_Toc242214447" w:history="1">
+            <w:r>
+              <w:rPr>
+                <w:rStyle w:val="Hipercze"/>
+                <w:noProof/>
+                <w:sz w:val="32"/>
+                <w:szCs w:val="32"/>
+              </w:rPr>
+              <w:t>4.</w:t>
+            </w:r>
+            <w:r>
+              <w:rPr>
+                <w:rFonts w:eastAsiaTheme="minorEastAsia"/>
+                <w:noProof/>
+                <w:sz w:val="32"/>
+                <w:szCs w:val="32"/>
+                <w:lang w:eastAsia="pl-PL"/>
+              </w:rPr>
+              <w:tab/>
+            </w:r>
+            <w:r>
+              <w:rPr>
+                <w:rStyle w:val="Hipercze"/>
+                <w:noProof/>
+                <w:sz w:val="32"/>
+                <w:szCs w:val="32"/>
+              </w:rPr>
+              <w:t>Projekt systemu</w:t>
+            </w:r>
+            <w:r>
+              <w:rPr>
+                <w:noProof/>
+                <w:webHidden/>
+                <w:sz w:val="32"/>
+                <w:szCs w:val="32"/>
+              </w:rPr>
+              <w:tab/>
+            </w:r>
+            <w:r>
+              <w:rPr>
+                <w:noProof/>
+                <w:webHidden/>
+                <w:sz w:val="32"/>
+                <w:szCs w:val="32"/>
+              </w:rPr>
+              <w:fldChar w:fldCharType="begin"/>
+            </w:r>
+            <w:r>
+              <w:rPr>
+                <w:noProof/>
+                <w:webHidden/>
+                <w:sz w:val="32"/>
+                <w:szCs w:val="32"/>
+              </w:rPr>
+              <w:instrText xml:space="preserve"> PAGEREF _Toc242214447 \h </w:instrText>
+            </w:r>
+            <w:r>
+              <w:rPr>
+                <w:noProof/>
+                <w:webHidden/>
+                <w:sz w:val="32"/>
+                <w:szCs w:val="32"/>
+              </w:rPr>
+            </w:r>
+            <w:r>
+              <w:rPr>
+                <w:noProof/>
+                <w:webHidden/>
+                <w:sz w:val="32"/>
+                <w:szCs w:val="32"/>
+              </w:rPr>
+              <w:fldChar w:fldCharType="separate"/>
+            </w:r>
+            <w:r>
+              <w:rPr>
+                <w:noProof/>
+                <w:webHidden/>
+                <w:sz w:val="32"/>
+                <w:szCs w:val="32"/>
+              </w:rPr>
+              <w:t>2</w:t>
+            </w:r>
+            <w:r>
+              <w:rPr>
+                <w:noProof/>
+                <w:webHidden/>
+                <w:sz w:val="32"/>
+                <w:szCs w:val="32"/>
+              </w:rPr>
+              <w:fldChar w:fldCharType="end"/>
+            </w:r>
+          </w:hyperlink>
+        </w:p>
+        <w:p>
+          <w:pPr>
+            <w:pStyle w:val="Spistreci1"/>
+            <w:tabs>
+              <w:tab w:val="left" w:pos="480"/>
+              <w:tab w:val="right" w:leader="dot" w:pos="9062"/>
+            </w:tabs>
+            <w:rPr>
+              <w:rFonts w:eastAsiaTheme="minorEastAsia"/>
+              <w:noProof/>
+              <w:sz w:val="32"/>
+              <w:szCs w:val="32"/>
+              <w:lang w:eastAsia="pl-PL"/>
+            </w:rPr>
+          </w:pPr>
+          <w:hyperlink w:anchor="_Toc242214448" w:history="1">
+            <w:r>
+              <w:rPr>
+                <w:rStyle w:val="Hipercze"/>
+                <w:noProof/>
+                <w:sz w:val="32"/>
+                <w:szCs w:val="32"/>
+              </w:rPr>
+              <w:t>5.</w:t>
+            </w:r>
+            <w:r>
+              <w:rPr>
+                <w:rFonts w:eastAsiaTheme="minorEastAsia"/>
+                <w:noProof/>
+                <w:sz w:val="32"/>
+                <w:szCs w:val="32"/>
+                <w:lang w:eastAsia="pl-PL"/>
+              </w:rPr>
+              <w:tab/>
+            </w:r>
+            <w:r>
+              <w:rPr>
+                <w:rStyle w:val="Hipercze"/>
+                <w:noProof/>
+                <w:sz w:val="32"/>
+                <w:szCs w:val="32"/>
+              </w:rPr>
+              <w:t>Dane</w:t>
+            </w:r>
+            <w:r>
+              <w:rPr>
+                <w:noProof/>
+                <w:webHidden/>
+                <w:sz w:val="32"/>
+                <w:szCs w:val="32"/>
+              </w:rPr>
+              <w:tab/>
+            </w:r>
+            <w:r>
+              <w:rPr>
+                <w:noProof/>
+                <w:webHidden/>
+                <w:sz w:val="32"/>
+                <w:szCs w:val="32"/>
+              </w:rPr>
+              <w:fldChar w:fldCharType="begin"/>
+            </w:r>
+            <w:r>
+              <w:rPr>
+                <w:noProof/>
+                <w:webHidden/>
+                <w:sz w:val="32"/>
+                <w:szCs w:val="32"/>
+              </w:rPr>
+              <w:instrText xml:space="preserve"> PAGEREF _Toc242214448 \h </w:instrText>
+            </w:r>
+            <w:r>
+              <w:rPr>
+                <w:noProof/>
+                <w:webHidden/>
+                <w:sz w:val="32"/>
+                <w:szCs w:val="32"/>
+              </w:rPr>
+            </w:r>
+            <w:r>
+              <w:rPr>
+                <w:noProof/>
+                <w:webHidden/>
+                <w:sz w:val="32"/>
+                <w:szCs w:val="32"/>
+              </w:rPr>
+              <w:fldChar w:fldCharType="separate"/>
+            </w:r>
+            <w:r>
+              <w:rPr>
+                <w:noProof/>
+                <w:webHidden/>
+                <w:sz w:val="32"/>
+                <w:szCs w:val="32"/>
+              </w:rPr>
+              <w:t>2</w:t>
+            </w:r>
+            <w:r>
+              <w:rPr>
+                <w:noProof/>
+                <w:webHidden/>
+                <w:sz w:val="32"/>
+                <w:szCs w:val="32"/>
+              </w:rPr>
+              <w:fldChar w:fldCharType="end"/>
+            </w:r>
+          </w:hyperlink>
+        </w:p>
+        <w:p>
+          <w:pPr>
+            <w:pStyle w:val="Spistreci1"/>
+            <w:tabs>
+              <w:tab w:val="left" w:pos="480"/>
+              <w:tab w:val="right" w:leader="dot" w:pos="9062"/>
+            </w:tabs>
+            <w:rPr>
+              <w:rFonts w:eastAsiaTheme="minorEastAsia"/>
+              <w:noProof/>
+              <w:sz w:val="32"/>
+              <w:szCs w:val="32"/>
+              <w:lang w:eastAsia="pl-PL"/>
+            </w:rPr>
+          </w:pPr>
+          <w:hyperlink w:anchor="_Toc242214449" w:history="1">
+            <w:r>
+              <w:rPr>
+                <w:rStyle w:val="Hipercze"/>
+                <w:noProof/>
+                <w:sz w:val="32"/>
+                <w:szCs w:val="32"/>
+              </w:rPr>
+              <w:t>6.</w:t>
+            </w:r>
+            <w:r>
+              <w:rPr>
+                <w:rFonts w:eastAsiaTheme="minorEastAsia"/>
+                <w:noProof/>
+                <w:sz w:val="32"/>
+                <w:szCs w:val="32"/>
+                <w:lang w:eastAsia="pl-PL"/>
+              </w:rPr>
+              <w:tab/>
+            </w:r>
+            <w:r>
+              <w:rPr>
+                <w:rStyle w:val="Hipercze"/>
+                <w:noProof/>
+                <w:sz w:val="32"/>
+                <w:szCs w:val="32"/>
+              </w:rPr>
+              <w:t>Implementacja</w:t>
+            </w:r>
+            <w:r>
+              <w:rPr>
+                <w:noProof/>
+                <w:webHidden/>
+                <w:sz w:val="32"/>
+                <w:szCs w:val="32"/>
+              </w:rPr>
+              <w:tab/>
+            </w:r>
+            <w:r>
+              <w:rPr>
+                <w:noProof/>
+                <w:webHidden/>
+                <w:sz w:val="32"/>
+                <w:szCs w:val="32"/>
+              </w:rPr>
+              <w:fldChar w:fldCharType="begin"/>
+            </w:r>
+            <w:r>
+              <w:rPr>
+                <w:noProof/>
+                <w:webHidden/>
+                <w:sz w:val="32"/>
+                <w:szCs w:val="32"/>
+              </w:rPr>
+              <w:instrText xml:space="preserve"> PAGEREF _Toc242214449 \h </w:instrText>
+            </w:r>
+            <w:r>
+              <w:rPr>
+                <w:noProof/>
+                <w:webHidden/>
+                <w:sz w:val="32"/>
+                <w:szCs w:val="32"/>
+              </w:rPr>
+            </w:r>
+            <w:r>
+              <w:rPr>
+                <w:noProof/>
+                <w:webHidden/>
+                <w:sz w:val="32"/>
+                <w:szCs w:val="32"/>
+              </w:rPr>
+              <w:fldChar w:fldCharType="separate"/>
+            </w:r>
+            <w:r>
+              <w:rPr>
+                <w:noProof/>
+                <w:webHidden/>
+                <w:sz w:val="32"/>
+                <w:szCs w:val="32"/>
+              </w:rPr>
+              <w:t>3</w:t>
+            </w:r>
+            <w:r>
+              <w:rPr>
+                <w:noProof/>
+                <w:webHidden/>
+                <w:sz w:val="32"/>
+                <w:szCs w:val="32"/>
+              </w:rPr>
+              <w:fldChar w:fldCharType="end"/>
+            </w:r>
+          </w:hyperlink>
+        </w:p>
+        <w:p>
+          <w:pPr>
+            <w:pStyle w:val="Spistreci1"/>
+            <w:tabs>
+              <w:tab w:val="left" w:pos="480"/>
+              <w:tab w:val="right" w:leader="dot" w:pos="9062"/>
+            </w:tabs>
+            <w:rPr>
+              <w:rFonts w:eastAsiaTheme="minorEastAsia"/>
+              <w:noProof/>
+              <w:sz w:val="32"/>
+              <w:szCs w:val="32"/>
+              <w:lang w:eastAsia="pl-PL"/>
+            </w:rPr>
+          </w:pPr>
+          <w:hyperlink w:anchor="_Toc242214450" w:history="1">
+            <w:r>
+              <w:rPr>
+                <w:rStyle w:val="Hipercze"/>
+                <w:noProof/>
+                <w:sz w:val="32"/>
+                <w:szCs w:val="32"/>
+              </w:rPr>
+              <w:t>7.</w:t>
+            </w:r>
+            <w:r>
+              <w:rPr>
+                <w:rFonts w:eastAsiaTheme="minorEastAsia"/>
+                <w:noProof/>
+                <w:sz w:val="32"/>
+                <w:szCs w:val="32"/>
+                <w:lang w:eastAsia="pl-PL"/>
+              </w:rPr>
+              <w:tab/>
+            </w:r>
+            <w:r>
+              <w:rPr>
+                <w:rStyle w:val="Hipercze"/>
+                <w:noProof/>
+                <w:sz w:val="32"/>
+                <w:szCs w:val="32"/>
+              </w:rPr>
+              <w:t>Eksperymenty i wyniki</w:t>
+            </w:r>
+            <w:r>
+              <w:rPr>
+                <w:noProof/>
+                <w:webHidden/>
+                <w:sz w:val="32"/>
+                <w:szCs w:val="32"/>
+              </w:rPr>
+              <w:tab/>
+            </w:r>
+            <w:r>
+              <w:rPr>
+                <w:noProof/>
+                <w:webHidden/>
+                <w:sz w:val="32"/>
+                <w:szCs w:val="32"/>
+              </w:rPr>
+              <w:fldChar w:fldCharType="begin"/>
+            </w:r>
+            <w:r>
+              <w:rPr>
+                <w:noProof/>
+                <w:webHidden/>
+                <w:sz w:val="32"/>
+                <w:szCs w:val="32"/>
+              </w:rPr>
+              <w:instrText xml:space="preserve"> PAGEREF _Toc242214450 \h </w:instrText>
+            </w:r>
+            <w:r>
+              <w:rPr>
+                <w:noProof/>
+                <w:webHidden/>
+                <w:sz w:val="32"/>
+                <w:szCs w:val="32"/>
+              </w:rPr>
+            </w:r>
+            <w:r>
+              <w:rPr>
+                <w:noProof/>
+                <w:webHidden/>
+                <w:sz w:val="32"/>
+                <w:szCs w:val="32"/>
+              </w:rPr>
+              <w:fldChar w:fldCharType="separate"/>
+            </w:r>
+            <w:r>
+              <w:rPr>
+                <w:noProof/>
+                <w:webHidden/>
+                <w:sz w:val="32"/>
+                <w:szCs w:val="32"/>
+              </w:rPr>
+              <w:t>3</w:t>
+            </w:r>
+            <w:r>
+              <w:rPr>
+                <w:noProof/>
+                <w:webHidden/>
+                <w:sz w:val="32"/>
+                <w:szCs w:val="32"/>
+              </w:rPr>
+              <w:fldChar w:fldCharType="end"/>
+            </w:r>
+          </w:hyperlink>
+        </w:p>
+        <w:p>
+          <w:pPr>
+            <w:pStyle w:val="Spistreci1"/>
+            <w:tabs>
+              <w:tab w:val="left" w:pos="480"/>
+              <w:tab w:val="right" w:leader="dot" w:pos="9062"/>
+            </w:tabs>
+            <w:rPr>
+              <w:rFonts w:eastAsiaTheme="minorEastAsia"/>
+              <w:noProof/>
+              <w:sz w:val="32"/>
+              <w:szCs w:val="32"/>
+              <w:lang w:eastAsia="pl-PL"/>
+            </w:rPr>
+          </w:pPr>
+          <w:hyperlink w:anchor="_Toc242214451" w:history="1">
+            <w:r>
+              <w:rPr>
+                <w:rStyle w:val="Hipercze"/>
+                <w:noProof/>
+                <w:sz w:val="32"/>
+                <w:szCs w:val="32"/>
+              </w:rPr>
+              <w:t>8.</w:t>
+            </w:r>
+            <w:r>
+              <w:rPr>
+                <w:rFonts w:eastAsiaTheme="minorEastAsia"/>
+                <w:noProof/>
+                <w:sz w:val="32"/>
+                <w:szCs w:val="32"/>
+                <w:lang w:eastAsia="pl-PL"/>
+              </w:rPr>
+              <w:tab/>
+            </w:r>
+            <w:r>
+              <w:rPr>
+                <w:rStyle w:val="Hipercze"/>
+                <w:noProof/>
+                <w:sz w:val="32"/>
+                <w:szCs w:val="32"/>
+              </w:rPr>
+              <w:t>Analiza wyników</w:t>
+            </w:r>
+            <w:r>
+              <w:rPr>
+                <w:noProof/>
+                <w:webHidden/>
+                <w:sz w:val="32"/>
+                <w:szCs w:val="32"/>
+              </w:rPr>
+              <w:tab/>
+            </w:r>
+            <w:r>
+              <w:rPr>
+                <w:noProof/>
+                <w:webHidden/>
+                <w:sz w:val="32"/>
+                <w:szCs w:val="32"/>
+              </w:rPr>
+              <w:fldChar w:fldCharType="begin"/>
+            </w:r>
+            <w:r>
+              <w:rPr>
+                <w:noProof/>
+                <w:webHidden/>
+                <w:sz w:val="32"/>
+                <w:szCs w:val="32"/>
+              </w:rPr>
+              <w:instrText xml:space="preserve"> PAGEREF _Toc242214451 \h </w:instrText>
+            </w:r>
+            <w:r>
+              <w:rPr>
+                <w:noProof/>
+                <w:webHidden/>
+                <w:sz w:val="32"/>
+                <w:szCs w:val="32"/>
+              </w:rPr>
+            </w:r>
+            <w:r>
+              <w:rPr>
+                <w:noProof/>
+                <w:webHidden/>
+                <w:sz w:val="32"/>
+                <w:szCs w:val="32"/>
+              </w:rPr>
+              <w:fldChar w:fldCharType="separate"/>
+            </w:r>
+            <w:r>
+              <w:rPr>
+                <w:noProof/>
+                <w:webHidden/>
+                <w:sz w:val="32"/>
+                <w:szCs w:val="32"/>
+              </w:rPr>
+              <w:t>3</w:t>
+            </w:r>
+            <w:r>
+              <w:rPr>
+                <w:noProof/>
+                <w:webHidden/>
+                <w:sz w:val="32"/>
+                <w:szCs w:val="32"/>
+              </w:rPr>
+              <w:fldChar w:fldCharType="end"/>
+            </w:r>
+          </w:hyperlink>
+        </w:p>
+        <w:p>
+          <w:pPr>
+            <w:pStyle w:val="Spistreci1"/>
+            <w:tabs>
+              <w:tab w:val="left" w:pos="480"/>
+              <w:tab w:val="right" w:leader="dot" w:pos="9062"/>
+            </w:tabs>
+            <w:rPr>
+              <w:rFonts w:eastAsiaTheme="minorEastAsia"/>
+              <w:noProof/>
+              <w:sz w:val="32"/>
+              <w:szCs w:val="32"/>
+              <w:lang w:eastAsia="pl-PL"/>
+            </w:rPr>
+          </w:pPr>
+          <w:hyperlink w:anchor="_Toc242214452" w:history="1">
+            <w:r>
+              <w:rPr>
+                <w:rStyle w:val="Hipercze"/>
+                <w:noProof/>
+                <w:sz w:val="32"/>
+                <w:szCs w:val="32"/>
+              </w:rPr>
+              <w:t>9.</w:t>
+            </w:r>
+            <w:r>
+              <w:rPr>
+                <w:rFonts w:eastAsiaTheme="minorEastAsia"/>
+                <w:noProof/>
+                <w:sz w:val="32"/>
+                <w:szCs w:val="32"/>
+                <w:lang w:eastAsia="pl-PL"/>
+              </w:rPr>
+              <w:tab/>
+            </w:r>
+            <w:r>
+              <w:rPr>
+                <w:rStyle w:val="Hipercze"/>
+                <w:noProof/>
+                <w:sz w:val="32"/>
+                <w:szCs w:val="32"/>
+              </w:rPr>
+              <w:t>Ograniczenia i kierunki rozwoju</w:t>
+            </w:r>
+            <w:r>
+              <w:rPr>
+                <w:noProof/>
+                <w:webHidden/>
+                <w:sz w:val="32"/>
+                <w:szCs w:val="32"/>
+              </w:rPr>
+              <w:tab/>
+            </w:r>
+            <w:r>
+              <w:rPr>
+                <w:noProof/>
+                <w:webHidden/>
+                <w:sz w:val="32"/>
+                <w:szCs w:val="32"/>
+              </w:rPr>
+              <w:fldChar w:fldCharType="begin"/>
+            </w:r>
+            <w:r>
+              <w:rPr>
+                <w:noProof/>
+                <w:webHidden/>
+                <w:sz w:val="32"/>
+                <w:szCs w:val="32"/>
+              </w:rPr>
+              <w:instrText xml:space="preserve"> PAGEREF _Toc242214452 \h </w:instrText>
+            </w:r>
+            <w:r>
+              <w:rPr>
+                <w:noProof/>
+                <w:webHidden/>
+                <w:sz w:val="32"/>
+                <w:szCs w:val="32"/>
+              </w:rPr>
+            </w:r>
+            <w:r>
+              <w:rPr>
+                <w:noProof/>
+                <w:webHidden/>
+                <w:sz w:val="32"/>
+                <w:szCs w:val="32"/>
+              </w:rPr>
+              <w:fldChar w:fldCharType="separate"/>
+            </w:r>
+            <w:r>
+              <w:rPr>
+                <w:noProof/>
+                <w:webHidden/>
+                <w:sz w:val="32"/>
+                <w:szCs w:val="32"/>
+              </w:rPr>
+              <w:t>3</w:t>
+            </w:r>
+            <w:r>
+              <w:rPr>
+                <w:noProof/>
+                <w:webHidden/>
+                <w:sz w:val="32"/>
+                <w:szCs w:val="32"/>
+              </w:rPr>
+              <w:fldChar w:fldCharType="end"/>
+            </w:r>
+          </w:hyperlink>
+        </w:p>
+        <w:p>
+          <w:pPr>
+            <w:pStyle w:val="Spistreci1"/>
+            <w:tabs>
+              <w:tab w:val="left" w:pos="720"/>
+              <w:tab w:val="right" w:leader="dot" w:pos="9062"/>
+            </w:tabs>
+            <w:rPr>
+              <w:rFonts w:eastAsiaTheme="minorEastAsia"/>
+              <w:noProof/>
+              <w:sz w:val="32"/>
+              <w:szCs w:val="32"/>
+              <w:lang w:eastAsia="pl-PL"/>
+            </w:rPr>
+          </w:pPr>
+          <w:hyperlink w:anchor="_Toc242214453" w:history="1">
+            <w:r>
+              <w:rPr>
+                <w:rStyle w:val="Hipercze"/>
+                <w:noProof/>
+                <w:sz w:val="32"/>
+                <w:szCs w:val="32"/>
+              </w:rPr>
+              <w:t>10.</w:t>
+            </w:r>
+            <w:r>
+              <w:rPr>
+                <w:rFonts w:eastAsiaTheme="minorEastAsia"/>
+                <w:noProof/>
+                <w:sz w:val="32"/>
+                <w:szCs w:val="32"/>
+                <w:lang w:eastAsia="pl-PL"/>
+              </w:rPr>
+              <w:tab/>
+            </w:r>
+            <w:r>
+              <w:rPr>
+                <w:rStyle w:val="Hipercze"/>
+                <w:noProof/>
+                <w:sz w:val="32"/>
+                <w:szCs w:val="32"/>
+              </w:rPr>
+              <w:t>Podsumowanie</w:t>
+            </w:r>
+            <w:r>
+              <w:rPr>
+                <w:noProof/>
+                <w:webHidden/>
+                <w:sz w:val="32"/>
+                <w:szCs w:val="32"/>
+              </w:rPr>
+              <w:tab/>
+            </w:r>
+            <w:r>
+              <w:rPr>
+                <w:noProof/>
+                <w:webHidden/>
+                <w:sz w:val="32"/>
+                <w:szCs w:val="32"/>
+              </w:rPr>
+              <w:fldChar w:fldCharType="begin"/>
+            </w:r>
+            <w:r>
+              <w:rPr>
+                <w:noProof/>
+                <w:webHidden/>
+                <w:sz w:val="32"/>
+                <w:szCs w:val="32"/>
+              </w:rPr>
+              <w:instrText xml:space="preserve"> PAGEREF _Toc242214453 \h </w:instrText>
+            </w:r>
+            <w:r>
+              <w:rPr>
+                <w:noProof/>
+                <w:webHidden/>
+                <w:sz w:val="32"/>
+                <w:szCs w:val="32"/>
+              </w:rPr>
+            </w:r>
+            <w:r>
+              <w:rPr>
+                <w:noProof/>
+                <w:webHidden/>
+                <w:sz w:val="32"/>
+                <w:szCs w:val="32"/>
+              </w:rPr>
+              <w:fldChar w:fldCharType="separate"/>
+            </w:r>
+            <w:r>
+              <w:rPr>
+                <w:noProof/>
+                <w:webHidden/>
+                <w:sz w:val="32"/>
+                <w:szCs w:val="32"/>
+              </w:rPr>
+              <w:t>3</w:t>
+            </w:r>
+            <w:r>
+              <w:rPr>
+                <w:noProof/>
+                <w:webHidden/>
+                <w:sz w:val="32"/>
+                <w:szCs w:val="32"/>
+              </w:rPr>
+              <w:fldChar w:fldCharType="end"/>
+            </w:r>
+          </w:hyperlink>
+        </w:p>
+        <w:p>
+          <w:pPr>
+            <w:pStyle w:val="Spistreci1"/>
+            <w:tabs>
+              <w:tab w:val="right" w:leader="dot" w:pos="9062"/>
+            </w:tabs>
+            <w:rPr>
+              <w:rFonts w:eastAsiaTheme="minorEastAsia"/>
+              <w:noProof/>
+              <w:sz w:val="32"/>
+              <w:szCs w:val="32"/>
+              <w:lang w:eastAsia="pl-PL"/>
+            </w:rPr>
+          </w:pPr>
+          <w:hyperlink w:anchor="_Toc242214454" w:history="1">
+            <w:r>
+              <w:rPr>
+                <w:rStyle w:val="Hipercze"/>
+                <w:noProof/>
+                <w:sz w:val="32"/>
+                <w:szCs w:val="32"/>
+              </w:rPr>
+              <w:t>Bibliografia</w:t>
+            </w:r>
+            <w:r>
+              <w:rPr>
+                <w:noProof/>
+                <w:webHidden/>
+                <w:sz w:val="32"/>
+                <w:szCs w:val="32"/>
+              </w:rPr>
+              <w:tab/>
+            </w:r>
+            <w:r>
+              <w:rPr>
+                <w:noProof/>
+                <w:webHidden/>
+                <w:sz w:val="32"/>
+                <w:szCs w:val="32"/>
+              </w:rPr>
+              <w:fldChar w:fldCharType="begin"/>
+            </w:r>
+            <w:r>
+              <w:rPr>
+                <w:noProof/>
+                <w:webHidden/>
+                <w:sz w:val="32"/>
+                <w:szCs w:val="32"/>
+              </w:rPr>
+              <w:instrText xml:space="preserve"> PAGEREF _Toc242214454 \h </w:instrText>
+            </w:r>
+            <w:r>
+              <w:rPr>
+                <w:noProof/>
+                <w:webHidden/>
+                <w:sz w:val="32"/>
+                <w:szCs w:val="32"/>
+              </w:rPr>
+            </w:r>
+            <w:r>
+              <w:rPr>
+                <w:noProof/>
+                <w:webHidden/>
+                <w:sz w:val="32"/>
+                <w:szCs w:val="32"/>
+              </w:rPr>
+              <w:fldChar w:fldCharType="separate"/>
+            </w:r>
+            <w:r>
+              <w:rPr>
+                <w:noProof/>
+                <w:webHidden/>
+                <w:sz w:val="32"/>
+                <w:szCs w:val="32"/>
+              </w:rPr>
+              <w:t>3</w:t>
+            </w:r>
+            <w:r>
+              <w:rPr>
+                <w:noProof/>
+                <w:webHidden/>
+                <w:sz w:val="32"/>
+                <w:szCs w:val="32"/>
+              </w:rPr>
+              <w:fldChar w:fldCharType="end"/>
+            </w:r>
+          </w:hyperlink>
+        </w:p>
+        <w:p>
+          <w:r>
+            <w:rPr>
+              <w:b/>
+              <w:bCs/>
+              <w:noProof/>
+              <w:sz w:val="32"/>
+              <w:szCs w:val="32"/>
+            </w:rPr>
+            <w:fldChar w:fldCharType="end"/>
+          </w:r>
         </w:p>
       </w:sdtContent>
     </w:sdt>
@@ -647,6 +2700,316 @@
         </w:rPr>
       </w:pPr>
     </w:p>
+    <w:p>
+      <w:r>
+        <w:rPr>
+          <w:b/>
+          <w:bCs/>
+          <w:color w:val="404040" w:themeColor="text1" w:themeTint="BF"/>
+          <w:sz w:val="48"/>
+          <w:szCs w:val="48"/>
+        </w:rPr>
+        <w:br w:type="page"/>
+      </w:r>
+    </w:p>
+    <w:p>
+      <w:pPr>
+        <w:pStyle w:val="Nagwek1"/>
+        <w:numPr>
+          <w:ilvl w:val="0"/>
+          <w:numId w:val="2"/>
+        </w:numPr>
+      </w:pPr>
+      <w:bookmarkStart w:id="0" w:name="_Toc242214436"/>
+      <w:r>
+        <w:lastRenderedPageBreak/>
+        <w:t>Wstęp</w:t>
+      </w:r>
+      <w:bookmarkEnd w:id="0"/>
+      <w:r>
+        <w:t xml:space="preserve"> </w:t>
+      </w:r>
+    </w:p>
+    <w:p/>
+    <w:p>
+      <w:pPr>
+        <w:pStyle w:val="Nagwek1"/>
+        <w:numPr>
+          <w:ilvl w:val="0"/>
+          <w:numId w:val="2"/>
+        </w:numPr>
+      </w:pPr>
+      <w:bookmarkStart w:id="1" w:name="_Toc242214437"/>
+      <w:r>
+        <w:t>Podstawy teoretyczne</w:t>
+      </w:r>
+      <w:bookmarkEnd w:id="1"/>
+    </w:p>
+    <w:p/>
+    <w:p>
+      <w:pPr>
+        <w:pStyle w:val="Nagwek2"/>
+        <w:numPr>
+          <w:ilvl w:val="1"/>
+          <w:numId w:val="2"/>
+        </w:numPr>
+      </w:pPr>
+      <w:bookmarkStart w:id="2" w:name="_Toc242214438"/>
+      <w:r>
+        <w:t>Uczenie maszynowe i głębokie</w:t>
+      </w:r>
+      <w:bookmarkEnd w:id="2"/>
+    </w:p>
+    <w:p/>
+    <w:p>
+      <w:pPr>
+        <w:pStyle w:val="Nagwek2"/>
+        <w:numPr>
+          <w:ilvl w:val="1"/>
+          <w:numId w:val="2"/>
+        </w:numPr>
+      </w:pPr>
+      <w:bookmarkStart w:id="3" w:name="_Toc242214439"/>
+      <w:r>
+        <w:t>Widzenie komputerowe</w:t>
+      </w:r>
+      <w:bookmarkEnd w:id="3"/>
+    </w:p>
+    <w:p/>
+    <w:p>
+      <w:pPr>
+        <w:pStyle w:val="Nagwek2"/>
+        <w:numPr>
+          <w:ilvl w:val="1"/>
+          <w:numId w:val="2"/>
+        </w:numPr>
+      </w:pPr>
+      <w:bookmarkStart w:id="4" w:name="_Toc242214440"/>
+      <w:r>
+        <w:t xml:space="preserve">Sieci </w:t>
+      </w:r>
+      <w:proofErr w:type="spellStart"/>
+      <w:r>
+        <w:t>konwolucyjne</w:t>
+      </w:r>
+      <w:bookmarkEnd w:id="4"/>
+      <w:proofErr w:type="spellEnd"/>
+    </w:p>
+    <w:p/>
+    <w:p>
+      <w:pPr>
+        <w:pStyle w:val="Nagwek2"/>
+        <w:numPr>
+          <w:ilvl w:val="1"/>
+          <w:numId w:val="2"/>
+        </w:numPr>
+      </w:pPr>
+      <w:bookmarkStart w:id="5" w:name="_Toc242214441"/>
+      <w:r>
+        <w:t>Klasyfikacja obrazów</w:t>
+      </w:r>
+      <w:bookmarkEnd w:id="5"/>
+    </w:p>
+    <w:p/>
+    <w:p>
+      <w:pPr>
+        <w:pStyle w:val="Nagwek2"/>
+        <w:numPr>
+          <w:ilvl w:val="1"/>
+          <w:numId w:val="2"/>
+        </w:numPr>
+      </w:pPr>
+      <w:bookmarkStart w:id="6" w:name="_Toc242214442"/>
+      <w:r>
+        <w:t>Detekcja obiektów i rodzina YOLO</w:t>
+      </w:r>
+      <w:bookmarkEnd w:id="6"/>
+    </w:p>
+    <w:p/>
+    <w:p>
+      <w:pPr>
+        <w:pStyle w:val="Nagwek2"/>
+        <w:numPr>
+          <w:ilvl w:val="1"/>
+          <w:numId w:val="2"/>
+        </w:numPr>
+      </w:pPr>
+      <w:bookmarkStart w:id="7" w:name="_Toc242214443"/>
+      <w:r>
+        <w:t>Transfer learning</w:t>
+      </w:r>
+      <w:bookmarkEnd w:id="7"/>
+    </w:p>
+    <w:p/>
+    <w:p>
+      <w:pPr>
+        <w:pStyle w:val="Nagwek2"/>
+        <w:numPr>
+          <w:ilvl w:val="1"/>
+          <w:numId w:val="2"/>
+        </w:numPr>
+      </w:pPr>
+      <w:bookmarkStart w:id="8" w:name="_Toc242214444"/>
+      <w:r>
+        <w:t>Augmentacja danych</w:t>
+      </w:r>
+      <w:bookmarkEnd w:id="8"/>
+    </w:p>
+    <w:p/>
+    <w:p>
+      <w:pPr>
+        <w:pStyle w:val="Nagwek2"/>
+        <w:numPr>
+          <w:ilvl w:val="1"/>
+          <w:numId w:val="2"/>
+        </w:numPr>
+      </w:pPr>
+      <w:bookmarkStart w:id="9" w:name="_Toc242214445"/>
+      <w:r>
+        <w:t>Metryki</w:t>
+      </w:r>
+      <w:bookmarkEnd w:id="9"/>
+    </w:p>
+    <w:p/>
+    <w:p>
+      <w:pPr>
+        <w:pStyle w:val="Nagwek1"/>
+        <w:numPr>
+          <w:ilvl w:val="0"/>
+          <w:numId w:val="2"/>
+        </w:numPr>
+      </w:pPr>
+      <w:bookmarkStart w:id="10" w:name="_Toc242214446"/>
+      <w:r>
+        <w:t>Analiza problemu i przegląd rozwiązań</w:t>
+      </w:r>
+      <w:bookmarkEnd w:id="10"/>
+    </w:p>
+    <w:p/>
+    <w:p>
+      <w:pPr>
+        <w:pStyle w:val="Nagwek1"/>
+        <w:numPr>
+          <w:ilvl w:val="0"/>
+          <w:numId w:val="2"/>
+        </w:numPr>
+      </w:pPr>
+      <w:bookmarkStart w:id="11" w:name="_Toc242214447"/>
+      <w:r>
+        <w:t>Projekt systemu</w:t>
+      </w:r>
+      <w:bookmarkEnd w:id="11"/>
+    </w:p>
+    <w:p/>
+    <w:p>
+      <w:pPr>
+        <w:pStyle w:val="Nagwek1"/>
+        <w:numPr>
+          <w:ilvl w:val="0"/>
+          <w:numId w:val="2"/>
+        </w:numPr>
+      </w:pPr>
+      <w:bookmarkStart w:id="12" w:name="_Toc242214448"/>
+      <w:r>
+        <w:t>Dane</w:t>
+      </w:r>
+      <w:bookmarkEnd w:id="12"/>
+    </w:p>
+    <w:p/>
+    <w:p>
+      <w:pPr>
+        <w:pStyle w:val="Nagwek1"/>
+        <w:numPr>
+          <w:ilvl w:val="0"/>
+          <w:numId w:val="2"/>
+        </w:numPr>
+      </w:pPr>
+      <w:bookmarkStart w:id="13" w:name="_Toc242214449"/>
+      <w:r>
+        <w:lastRenderedPageBreak/>
+        <w:t>Implementacja</w:t>
+      </w:r>
+      <w:bookmarkEnd w:id="13"/>
+    </w:p>
+    <w:p/>
+    <w:p>
+      <w:pPr>
+        <w:pStyle w:val="Nagwek1"/>
+        <w:numPr>
+          <w:ilvl w:val="0"/>
+          <w:numId w:val="2"/>
+        </w:numPr>
+      </w:pPr>
+      <w:bookmarkStart w:id="14" w:name="_Toc242214450"/>
+      <w:r>
+        <w:t>Eksperymenty i wyniki</w:t>
+      </w:r>
+      <w:bookmarkEnd w:id="14"/>
+    </w:p>
+    <w:p/>
+    <w:p>
+      <w:pPr>
+        <w:pStyle w:val="Nagwek1"/>
+        <w:numPr>
+          <w:ilvl w:val="0"/>
+          <w:numId w:val="2"/>
+        </w:numPr>
+      </w:pPr>
+      <w:bookmarkStart w:id="15" w:name="_Toc242214451"/>
+      <w:r>
+        <w:t>Analiza wyników</w:t>
+      </w:r>
+      <w:bookmarkEnd w:id="15"/>
+    </w:p>
+    <w:p/>
+    <w:p>
+      <w:pPr>
+        <w:pStyle w:val="Nagwek1"/>
+        <w:numPr>
+          <w:ilvl w:val="0"/>
+          <w:numId w:val="2"/>
+        </w:numPr>
+      </w:pPr>
+      <w:bookmarkStart w:id="16" w:name="_Toc242214452"/>
+      <w:r>
+        <w:t>Ograniczenia i kierunki rozwoju</w:t>
+      </w:r>
+      <w:bookmarkEnd w:id="16"/>
+    </w:p>
+    <w:p/>
+    <w:p>
+      <w:pPr>
+        <w:pStyle w:val="Nagwek1"/>
+        <w:numPr>
+          <w:ilvl w:val="0"/>
+          <w:numId w:val="2"/>
+        </w:numPr>
+      </w:pPr>
+      <w:bookmarkStart w:id="17" w:name="_Toc242214453"/>
+      <w:r>
+        <w:t>Podsumowanie</w:t>
+      </w:r>
+      <w:bookmarkEnd w:id="17"/>
+      <w:r>
+        <w:t xml:space="preserve"> </w:t>
+      </w:r>
+    </w:p>
+    <w:p/>
+    <w:p>
+      <w:pPr>
+        <w:pStyle w:val="Nagwek1"/>
+      </w:pPr>
+      <w:bookmarkStart w:id="18" w:name="_Toc242214454"/>
+      <w:r>
+        <w:t>Bibliografia</w:t>
+      </w:r>
+      <w:bookmarkEnd w:id="18"/>
+    </w:p>
+    <w:p/>
+    <w:p/>
+    <w:p/>
+    <w:p/>
+    <w:p/>
     <w:sectPr>
       <w:pgSz w:w="11906" w:h="16838"/>
       <w:pgMar w:top="1417" w:right="1417" w:bottom="1417" w:left="1417" w:header="708" w:footer="708" w:gutter="0"/>
@@ -657,6 +3020,259 @@
     </w:sectPr>
   </w:body>
 </w:document>
+</file>
+
+<file path=word/numbering.xml><?xml version="1.0" encoding="utf-8"?>
+<w:numbering xmlns:wpc="http://schemas.microsoft.com/office/word/2010/wordprocessingCanvas" xmlns:cx="http://schemas.microsoft.com/office/drawing/2014/chartex" xmlns:cx1="http://schemas.microsoft.com/office/drawing/2015/9/8/chartex" xmlns:cx2="http://schemas.microsoft.com/office/drawing/2015/10/21/chartex" xmlns:cx3="http://schemas.microsoft.com/office/drawing/2016/5/9/chartex" xmlns:cx4="http://schemas.microsoft.com/office/drawing/2016/5/10/chartex" xmlns:cx5="http://schemas.microsoft.com/office/drawing/2016/5/11/chartex" xmlns:cx6="http://schemas.microsoft.com/office/drawing/2016/5/12/chartex" xmlns:cx7="http://schemas.microsoft.com/office/drawing/2016/5/13/chartex" xmlns:cx8="http://schemas.microsoft.com/office/drawing/2016/5/14/chartex" xmlns:mc="http://schemas.openxmlformats.org/markup-compatibility/2006" xmlns:aink="http://schemas.microsoft.com/office/drawing/2016/ink" xmlns:am3d="http://schemas.microsoft.com/office/drawing/2017/model3d" xmlns:o="urn:schemas-microsoft-com:office:office" xmlns:oel="http://schemas.microsoft.com/office/2019/extlst" xmlns:r="http://schemas.openxmlformats.org/officeDocument/2006/relationships" xmlns:m="http://schemas.openxmlformats.org/officeDocument/2006/math" xmlns:v="urn:schemas-microsoft-com:vml" xmlns:wp14="http://schemas.microsoft.com/office/word/2010/wordprocessingDrawing" xmlns:wp="http://schemas.openxmlformats.org/drawingml/2006/wordprocessingDrawing" xmlns:w10="urn:schemas-microsoft-com:office:word" xmlns:w="http://schemas.openxmlformats.org/wordprocessingml/2006/main" xmlns:w14="http://schemas.microsoft.com/office/word/2010/wordml" xmlns:w15="http://schemas.microsoft.com/office/word/2012/wordml" xmlns:w16cex="http://schemas.microsoft.com/office/word/2018/wordml/cex" xmlns:w16cid="http://schemas.microsoft.com/office/word/2016/wordml/cid" xmlns:w16="http://schemas.microsoft.com/office/word/2018/wordml" xmlns:w16du="http://schemas.microsoft.com/office/word/2023/wordml/word16du" xmlns:w16sdtdh="http://schemas.microsoft.com/office/word/2020/wordml/sdtdatahash" xmlns:w16sdtfl="http://schemas.microsoft.com/office/word/2024/wordml/sdtformatlock" xmlns:w16se="http://schemas.microsoft.com/office/word/2015/wordml/symex" xmlns:wpg="http://schemas.microsoft.com/office/word/2010/wordprocessingGroup" xmlns:wpi="http://schemas.microsoft.com/office/word/2010/wordprocessingInk" xmlns:wne="http://schemas.microsoft.com/office/word/2006/wordml" xmlns:wps="http://schemas.microsoft.com/office/word/2010/wordprocessingShape" mc:Ignorable="w14 w15 w16se w16cid w16 w16cex w16sdtdh w16sdtfl w16du wp14">
+  <w:abstractNum w:abstractNumId="0" w15:restartNumberingAfterBreak="0">
+    <w:nsid w:val="35CF7468"/>
+    <w:multiLevelType w:val="multilevel"/>
+    <w:tmpl w:val="5B7E601A"/>
+    <w:lvl w:ilvl="0">
+      <w:start w:val="1"/>
+      <w:numFmt w:val="decimal"/>
+      <w:lvlText w:val="%1."/>
+      <w:lvlJc w:val="left"/>
+      <w:pPr>
+        <w:ind w:left="720" w:hanging="360"/>
+      </w:pPr>
+      <w:rPr>
+        <w:rFonts w:hint="default"/>
+      </w:rPr>
+    </w:lvl>
+    <w:lvl w:ilvl="1">
+      <w:start w:val="1"/>
+      <w:numFmt w:val="decimal"/>
+      <w:isLgl/>
+      <w:lvlText w:val="%1.%2."/>
+      <w:lvlJc w:val="left"/>
+      <w:pPr>
+        <w:ind w:left="1080" w:hanging="720"/>
+      </w:pPr>
+      <w:rPr>
+        <w:rFonts w:hint="default"/>
+      </w:rPr>
+    </w:lvl>
+    <w:lvl w:ilvl="2">
+      <w:start w:val="1"/>
+      <w:numFmt w:val="decimal"/>
+      <w:isLgl/>
+      <w:lvlText w:val="%1.%2.%3."/>
+      <w:lvlJc w:val="left"/>
+      <w:pPr>
+        <w:ind w:left="1440" w:hanging="1080"/>
+      </w:pPr>
+      <w:rPr>
+        <w:rFonts w:hint="default"/>
+      </w:rPr>
+    </w:lvl>
+    <w:lvl w:ilvl="3">
+      <w:start w:val="1"/>
+      <w:numFmt w:val="decimal"/>
+      <w:isLgl/>
+      <w:lvlText w:val="%1.%2.%3.%4."/>
+      <w:lvlJc w:val="left"/>
+      <w:pPr>
+        <w:ind w:left="1440" w:hanging="1080"/>
+      </w:pPr>
+      <w:rPr>
+        <w:rFonts w:hint="default"/>
+      </w:rPr>
+    </w:lvl>
+    <w:lvl w:ilvl="4">
+      <w:start w:val="1"/>
+      <w:numFmt w:val="decimal"/>
+      <w:isLgl/>
+      <w:lvlText w:val="%1.%2.%3.%4.%5."/>
+      <w:lvlJc w:val="left"/>
+      <w:pPr>
+        <w:ind w:left="1800" w:hanging="1440"/>
+      </w:pPr>
+      <w:rPr>
+        <w:rFonts w:hint="default"/>
+      </w:rPr>
+    </w:lvl>
+    <w:lvl w:ilvl="5">
+      <w:start w:val="1"/>
+      <w:numFmt w:val="decimal"/>
+      <w:isLgl/>
+      <w:lvlText w:val="%1.%2.%3.%4.%5.%6."/>
+      <w:lvlJc w:val="left"/>
+      <w:pPr>
+        <w:ind w:left="2160" w:hanging="1800"/>
+      </w:pPr>
+      <w:rPr>
+        <w:rFonts w:hint="default"/>
+      </w:rPr>
+    </w:lvl>
+    <w:lvl w:ilvl="6">
+      <w:start w:val="1"/>
+      <w:numFmt w:val="decimal"/>
+      <w:isLgl/>
+      <w:lvlText w:val="%1.%2.%3.%4.%5.%6.%7."/>
+      <w:lvlJc w:val="left"/>
+      <w:pPr>
+        <w:ind w:left="2520" w:hanging="2160"/>
+      </w:pPr>
+      <w:rPr>
+        <w:rFonts w:hint="default"/>
+      </w:rPr>
+    </w:lvl>
+    <w:lvl w:ilvl="7">
+      <w:start w:val="1"/>
+      <w:numFmt w:val="decimal"/>
+      <w:isLgl/>
+      <w:lvlText w:val="%1.%2.%3.%4.%5.%6.%7.%8."/>
+      <w:lvlJc w:val="left"/>
+      <w:pPr>
+        <w:ind w:left="2520" w:hanging="2160"/>
+      </w:pPr>
+      <w:rPr>
+        <w:rFonts w:hint="default"/>
+      </w:rPr>
+    </w:lvl>
+    <w:lvl w:ilvl="8">
+      <w:start w:val="1"/>
+      <w:numFmt w:val="decimal"/>
+      <w:isLgl/>
+      <w:lvlText w:val="%1.%2.%3.%4.%5.%6.%7.%8.%9."/>
+      <w:lvlJc w:val="left"/>
+      <w:pPr>
+        <w:ind w:left="2880" w:hanging="2520"/>
+      </w:pPr>
+      <w:rPr>
+        <w:rFonts w:hint="default"/>
+      </w:rPr>
+    </w:lvl>
+  </w:abstractNum>
+  <w:abstractNum w:abstractNumId="1" w15:restartNumberingAfterBreak="0">
+    <w:nsid w:val="74721B65"/>
+    <w:multiLevelType w:val="multilevel"/>
+    <w:tmpl w:val="C156B7C8"/>
+    <w:lvl w:ilvl="0">
+      <w:start w:val="1"/>
+      <w:numFmt w:val="decimal"/>
+      <w:lvlText w:val="%1."/>
+      <w:lvlJc w:val="left"/>
+      <w:pPr>
+        <w:ind w:left="720" w:hanging="360"/>
+      </w:pPr>
+      <w:rPr>
+        <w:rFonts w:hint="default"/>
+      </w:rPr>
+    </w:lvl>
+    <w:lvl w:ilvl="1">
+      <w:start w:val="1"/>
+      <w:numFmt w:val="decimal"/>
+      <w:isLgl/>
+      <w:lvlText w:val="%1.%2."/>
+      <w:lvlJc w:val="left"/>
+      <w:pPr>
+        <w:ind w:left="1080" w:hanging="720"/>
+      </w:pPr>
+      <w:rPr>
+        <w:rFonts w:hint="default"/>
+      </w:rPr>
+    </w:lvl>
+    <w:lvl w:ilvl="2">
+      <w:start w:val="1"/>
+      <w:numFmt w:val="decimal"/>
+      <w:isLgl/>
+      <w:lvlText w:val="%1.%2.%3."/>
+      <w:lvlJc w:val="left"/>
+      <w:pPr>
+        <w:ind w:left="1440" w:hanging="1080"/>
+      </w:pPr>
+      <w:rPr>
+        <w:rFonts w:hint="default"/>
+      </w:rPr>
+    </w:lvl>
+    <w:lvl w:ilvl="3">
+      <w:start w:val="1"/>
+      <w:numFmt w:val="decimal"/>
+      <w:isLgl/>
+      <w:lvlText w:val="%1.%2.%3.%4."/>
+      <w:lvlJc w:val="left"/>
+      <w:pPr>
+        <w:ind w:left="1440" w:hanging="1080"/>
+      </w:pPr>
+      <w:rPr>
+        <w:rFonts w:hint="default"/>
+      </w:rPr>
+    </w:lvl>
+    <w:lvl w:ilvl="4">
+      <w:start w:val="1"/>
+      <w:numFmt w:val="decimal"/>
+      <w:isLgl/>
+      <w:lvlText w:val="%1.%2.%3.%4.%5."/>
+      <w:lvlJc w:val="left"/>
+      <w:pPr>
+        <w:ind w:left="1800" w:hanging="1440"/>
+      </w:pPr>
+      <w:rPr>
+        <w:rFonts w:hint="default"/>
+      </w:rPr>
+    </w:lvl>
+    <w:lvl w:ilvl="5">
+      <w:start w:val="1"/>
+      <w:numFmt w:val="decimal"/>
+      <w:isLgl/>
+      <w:lvlText w:val="%1.%2.%3.%4.%5.%6."/>
+      <w:lvlJc w:val="left"/>
+      <w:pPr>
+        <w:ind w:left="2160" w:hanging="1800"/>
+      </w:pPr>
+      <w:rPr>
+        <w:rFonts w:hint="default"/>
+      </w:rPr>
+    </w:lvl>
+    <w:lvl w:ilvl="6">
+      <w:start w:val="1"/>
+      <w:numFmt w:val="decimal"/>
+      <w:isLgl/>
+      <w:lvlText w:val="%1.%2.%3.%4.%5.%6.%7."/>
+      <w:lvlJc w:val="left"/>
+      <w:pPr>
+        <w:ind w:left="2520" w:hanging="2160"/>
+      </w:pPr>
+      <w:rPr>
+        <w:rFonts w:hint="default"/>
+      </w:rPr>
+    </w:lvl>
+    <w:lvl w:ilvl="7">
+      <w:start w:val="1"/>
+      <w:numFmt w:val="decimal"/>
+      <w:isLgl/>
+      <w:lvlText w:val="%1.%2.%3.%4.%5.%6.%7.%8."/>
+      <w:lvlJc w:val="left"/>
+      <w:pPr>
+        <w:ind w:left="2520" w:hanging="2160"/>
+      </w:pPr>
+      <w:rPr>
+        <w:rFonts w:hint="default"/>
+      </w:rPr>
+    </w:lvl>
+    <w:lvl w:ilvl="8">
+      <w:start w:val="1"/>
+      <w:numFmt w:val="decimal"/>
+      <w:isLgl/>
+      <w:lvlText w:val="%1.%2.%3.%4.%5.%6.%7.%8.%9."/>
+      <w:lvlJc w:val="left"/>
+      <w:pPr>
+        <w:ind w:left="2880" w:hanging="2520"/>
+      </w:pPr>
+      <w:rPr>
+        <w:rFonts w:hint="default"/>
+      </w:rPr>
+    </w:lvl>
+  </w:abstractNum>
+  <w:num w:numId="1" w16cid:durableId="501579601">
+    <w:abstractNumId w:val="0"/>
+  </w:num>
+  <w:num w:numId="2" w16cid:durableId="1513110947">
+    <w:abstractNumId w:val="1"/>
+  </w:num>
+</w:numbering>
 </file>
 
 <file path=word/styles.xml><?xml version="1.0" encoding="utf-8"?>
@@ -1067,7 +3683,7 @@
     <w:link w:val="Nagwek1Znak"/>
     <w:uiPriority w:val="9"/>
     <w:qFormat/>
-    <w:rsid w:val="00760ABE"/>
+    <w:rsid w:val="008D6C6A"/>
     <w:pPr>
       <w:keepNext/>
       <w:keepLines/>
@@ -1076,6 +3692,7 @@
     </w:pPr>
     <w:rPr>
       <w:rFonts w:asciiTheme="majorHAnsi" w:eastAsiaTheme="majorEastAsia" w:hAnsiTheme="majorHAnsi" w:cstheme="majorBidi"/>
+      <w:b/>
       <w:color w:val="0F4761" w:themeColor="accent1" w:themeShade="BF"/>
       <w:sz w:val="40"/>
       <w:szCs w:val="40"/>
@@ -1087,10 +3704,9 @@
     <w:next w:val="Normalny"/>
     <w:link w:val="Nagwek2Znak"/>
     <w:uiPriority w:val="9"/>
-    <w:semiHidden/>
     <w:unhideWhenUsed/>
     <w:qFormat/>
-    <w:rsid w:val="00760ABE"/>
+    <w:rsid w:val="008D6C6A"/>
     <w:pPr>
       <w:keepNext/>
       <w:keepLines/>
@@ -1099,6 +3715,7 @@
     </w:pPr>
     <w:rPr>
       <w:rFonts w:asciiTheme="majorHAnsi" w:eastAsiaTheme="majorEastAsia" w:hAnsiTheme="majorHAnsi" w:cstheme="majorBidi"/>
+      <w:b/>
       <w:color w:val="0F4761" w:themeColor="accent1" w:themeShade="BF"/>
       <w:sz w:val="32"/>
       <w:szCs w:val="32"/>
@@ -1291,9 +3908,10 @@
     <w:basedOn w:val="Domylnaczcionkaakapitu"/>
     <w:link w:val="Nagwek1"/>
     <w:uiPriority w:val="9"/>
-    <w:rsid w:val="00760ABE"/>
+    <w:rsid w:val="008D6C6A"/>
     <w:rPr>
       <w:rFonts w:asciiTheme="majorHAnsi" w:eastAsiaTheme="majorEastAsia" w:hAnsiTheme="majorHAnsi" w:cstheme="majorBidi"/>
+      <w:b/>
       <w:color w:val="0F4761" w:themeColor="accent1" w:themeShade="BF"/>
       <w:sz w:val="40"/>
       <w:szCs w:val="40"/>
@@ -1304,10 +3922,10 @@
     <w:basedOn w:val="Domylnaczcionkaakapitu"/>
     <w:link w:val="Nagwek2"/>
     <w:uiPriority w:val="9"/>
-    <w:semiHidden/>
-    <w:rsid w:val="00760ABE"/>
+    <w:rsid w:val="008D6C6A"/>
     <w:rPr>
       <w:rFonts w:asciiTheme="majorHAnsi" w:eastAsiaTheme="majorEastAsia" w:hAnsiTheme="majorHAnsi" w:cstheme="majorBidi"/>
+      <w:b/>
       <w:color w:val="0F4761" w:themeColor="accent1" w:themeShade="BF"/>
       <w:sz w:val="32"/>
       <w:szCs w:val="32"/>
@@ -1625,6 +4243,42 @@
       <w14:ligatures w14:val="none"/>
     </w:rPr>
   </w:style>
+  <w:style w:type="paragraph" w:styleId="Spistreci1">
+    <w:name w:val="toc 1"/>
+    <w:basedOn w:val="Normalny"/>
+    <w:next w:val="Normalny"/>
+    <w:autoRedefine/>
+    <w:uiPriority w:val="39"/>
+    <w:unhideWhenUsed/>
+    <w:rsid w:val="008D6C6A"/>
+    <w:pPr>
+      <w:spacing w:after="100"/>
+    </w:pPr>
+  </w:style>
+  <w:style w:type="character" w:styleId="Hipercze">
+    <w:name w:val="Hyperlink"/>
+    <w:basedOn w:val="Domylnaczcionkaakapitu"/>
+    <w:uiPriority w:val="99"/>
+    <w:unhideWhenUsed/>
+    <w:rsid w:val="008D6C6A"/>
+    <w:rPr>
+      <w:color w:val="467886" w:themeColor="hyperlink"/>
+      <w:u w:val="single"/>
+    </w:rPr>
+  </w:style>
+  <w:style w:type="paragraph" w:styleId="Spistreci2">
+    <w:name w:val="toc 2"/>
+    <w:basedOn w:val="Normalny"/>
+    <w:next w:val="Normalny"/>
+    <w:autoRedefine/>
+    <w:uiPriority w:val="39"/>
+    <w:unhideWhenUsed/>
+    <w:rsid w:val="00DE6DC7"/>
+    <w:pPr>
+      <w:spacing w:after="100"/>
+      <w:ind w:left="220"/>
+    </w:pPr>
+  </w:style>
 </w:styles>
 </file>
 
@@ -1701,18 +4355,18 @@
 
 <file path=word/glossary/fontTable.xml><?xml version="1.0" encoding="utf-8"?>
 <w:fonts xmlns:mc="http://schemas.openxmlformats.org/markup-compatibility/2006" xmlns:r="http://schemas.openxmlformats.org/officeDocument/2006/relationships" xmlns:w="http://schemas.openxmlformats.org/wordprocessingml/2006/main" xmlns:w14="http://schemas.microsoft.com/office/word/2010/wordml" xmlns:w15="http://schemas.microsoft.com/office/word/2012/wordml" xmlns:w16cex="http://schemas.microsoft.com/office/word/2018/wordml/cex" xmlns:w16cid="http://schemas.microsoft.com/office/word/2016/wordml/cid" xmlns:w16="http://schemas.microsoft.com/office/word/2018/wordml" xmlns:w16du="http://schemas.microsoft.com/office/word/2023/wordml/word16du" xmlns:w16sdtdh="http://schemas.microsoft.com/office/word/2020/wordml/sdtdatahash" xmlns:w16sdtfl="http://schemas.microsoft.com/office/word/2024/wordml/sdtformatlock" xmlns:w16se="http://schemas.microsoft.com/office/word/2015/wordml/symex" mc:Ignorable="w14 w15 w16se w16cid w16 w16cex w16sdtdh w16sdtfl w16du">
-  <w:font w:name="Aptos">
-    <w:charset w:val="00"/>
-    <w:family w:val="swiss"/>
-    <w:pitch w:val="variable"/>
-    <w:sig w:usb0="20000287" w:usb1="00000003" w:usb2="00000000" w:usb3="00000000" w:csb0="0000019F" w:csb1="00000000"/>
-  </w:font>
   <w:font w:name="Times New Roman">
     <w:panose1 w:val="02020603050405020304"/>
     <w:charset w:val="00"/>
     <w:family w:val="roman"/>
     <w:pitch w:val="variable"/>
     <w:sig w:usb0="E0002EFF" w:usb1="C000785B" w:usb2="00000009" w:usb3="00000000" w:csb0="000001FF" w:csb1="00000000"/>
+  </w:font>
+  <w:font w:name="Aptos">
+    <w:charset w:val="00"/>
+    <w:family w:val="swiss"/>
+    <w:pitch w:val="variable"/>
+    <w:sig w:usb0="20000287" w:usb1="00000003" w:usb2="00000000" w:usb3="00000000" w:csb0="0000019F" w:csb1="00000000"/>
   </w:font>
   <w:font w:name="Aptos Display">
     <w:charset w:val="00"/>
@@ -1741,7 +4395,10 @@
   <w:rsids>
     <w:rsidRoot w:val="00B35849"/>
     <w:rsid w:val="000E588C"/>
+    <w:rsid w:val="00390BBD"/>
     <w:rsid w:val="00464E55"/>
+    <w:rsid w:val="005A5550"/>
+    <w:rsid w:val="00A85697"/>
     <w:rsid w:val="00B35849"/>
   </w:rsids>
   <m:mathPr>

</xml_diff>